<commit_message>
writing, reading, listening of IELTS
</commit_message>
<xml_diff>
--- a/IELTS Notes/Notes of IELTS.docx
+++ b/IELTS Notes/Notes of IELTS.docx
@@ -5743,39 +5743,167 @@
           <w:sz w:val="24"/>
           <w:szCs w:val="24"/>
         </w:rPr>
-        <w:t>In true or false questions a</w:t>
-      </w:r>
-      <w:r>
-        <w:rPr>
-          <w:rFonts w:ascii="Times New Roman" w:hAnsi="Times New Roman" w:cs="Times New Roman" w:hint="eastAsia"/>
-          <w:sz w:val="24"/>
-          <w:szCs w:val="24"/>
-        </w:rPr>
-        <w:t>nswers come in order</w:t>
-      </w:r>
-      <w:r>
-        <w:rPr>
-          <w:rFonts w:ascii="Times New Roman" w:hAnsi="Times New Roman" w:cs="Times New Roman" w:hint="eastAsia"/>
-          <w:sz w:val="24"/>
-          <w:szCs w:val="24"/>
-        </w:rPr>
-        <w:t xml:space="preserve"> in the passage</w:t>
-      </w:r>
-      <w:r>
-        <w:rPr>
-          <w:rFonts w:ascii="Times New Roman" w:hAnsi="Times New Roman" w:cs="Times New Roman" w:hint="eastAsia"/>
-          <w:sz w:val="24"/>
-          <w:szCs w:val="24"/>
-        </w:rPr>
-        <w:t xml:space="preserve">. </w:t>
-      </w:r>
-      <w:r>
-        <w:rPr>
-          <w:rFonts w:ascii="Times New Roman" w:hAnsi="Times New Roman" w:cs="Times New Roman" w:hint="eastAsia"/>
-          <w:sz w:val="24"/>
-          <w:szCs w:val="24"/>
-        </w:rPr>
-        <w:t>(Important)</w:t>
+        <w:t>In TRUE/FALSE or YES/NO questions</w:t>
+      </w:r>
+      <w:r>
+        <w:rPr>
+          <w:rFonts w:ascii="Times New Roman" w:hAnsi="Times New Roman" w:cs="Times New Roman" w:hint="eastAsia"/>
+          <w:sz w:val="24"/>
+          <w:szCs w:val="24"/>
+        </w:rPr>
+        <w:t>, answers come in order in the passage(Important). P</w:t>
+      </w:r>
+      <w:r>
+        <w:rPr>
+          <w:rFonts w:ascii="Times New Roman" w:hAnsi="Times New Roman" w:cs="Times New Roman" w:hint="eastAsia"/>
+          <w:sz w:val="24"/>
+          <w:szCs w:val="24"/>
+        </w:rPr>
+        <w:t xml:space="preserve">ay attention to the next question. If the </w:t>
+      </w:r>
+      <w:r>
+        <w:rPr>
+          <w:rFonts w:ascii="Times New Roman" w:hAnsi="Times New Roman" w:cs="Times New Roman" w:hint="eastAsia"/>
+          <w:sz w:val="24"/>
+          <w:szCs w:val="24"/>
+        </w:rPr>
+        <w:t xml:space="preserve">answer of </w:t>
+      </w:r>
+      <w:r>
+        <w:rPr>
+          <w:rFonts w:ascii="Times New Roman" w:hAnsi="Times New Roman" w:cs="Times New Roman" w:hint="eastAsia"/>
+          <w:sz w:val="24"/>
+          <w:szCs w:val="24"/>
+        </w:rPr>
+        <w:t xml:space="preserve">Question 2 were not </w:t>
+      </w:r>
+      <w:r>
+        <w:rPr>
+          <w:rFonts w:ascii="Times New Roman" w:hAnsi="Times New Roman" w:cs="Times New Roman" w:hint="eastAsia"/>
+          <w:sz w:val="24"/>
+          <w:szCs w:val="24"/>
+        </w:rPr>
+        <w:t>found</w:t>
+      </w:r>
+      <w:r>
+        <w:rPr>
+          <w:rFonts w:ascii="Times New Roman" w:hAnsi="Times New Roman" w:cs="Times New Roman" w:hint="eastAsia"/>
+          <w:sz w:val="24"/>
+          <w:szCs w:val="24"/>
+        </w:rPr>
+        <w:t>(maybe it is NOT GIVEN)</w:t>
+      </w:r>
+      <w:r>
+        <w:rPr>
+          <w:rFonts w:ascii="Times New Roman" w:hAnsi="Times New Roman" w:cs="Times New Roman" w:hint="eastAsia"/>
+          <w:sz w:val="24"/>
+          <w:szCs w:val="24"/>
+        </w:rPr>
+        <w:t>, don</w:t>
+      </w:r>
+      <w:r>
+        <w:rPr>
+          <w:rFonts w:ascii="Times New Roman" w:hAnsi="Times New Roman" w:cs="Times New Roman"/>
+          <w:sz w:val="24"/>
+          <w:szCs w:val="24"/>
+        </w:rPr>
+        <w:t>’</w:t>
+      </w:r>
+      <w:r>
+        <w:rPr>
+          <w:rFonts w:ascii="Times New Roman" w:hAnsi="Times New Roman" w:cs="Times New Roman" w:hint="eastAsia"/>
+          <w:sz w:val="24"/>
+          <w:szCs w:val="24"/>
+        </w:rPr>
+        <w:t xml:space="preserve">t </w:t>
+      </w:r>
+      <w:r>
+        <w:rPr>
+          <w:rFonts w:ascii="Times New Roman" w:hAnsi="Times New Roman" w:cs="Times New Roman" w:hint="eastAsia"/>
+          <w:sz w:val="24"/>
+          <w:szCs w:val="24"/>
+        </w:rPr>
+        <w:t>read through all the passage to find an answer but</w:t>
+      </w:r>
+      <w:r>
+        <w:rPr>
+          <w:rFonts w:ascii="Times New Roman" w:hAnsi="Times New Roman" w:cs="Times New Roman" w:hint="eastAsia"/>
+          <w:sz w:val="24"/>
+          <w:szCs w:val="24"/>
+        </w:rPr>
+        <w:t xml:space="preserve"> stop </w:t>
+      </w:r>
+      <w:r>
+        <w:rPr>
+          <w:rFonts w:ascii="Times New Roman" w:hAnsi="Times New Roman" w:cs="Times New Roman" w:hint="eastAsia"/>
+          <w:sz w:val="24"/>
+          <w:szCs w:val="24"/>
+        </w:rPr>
+        <w:t>at</w:t>
+      </w:r>
+      <w:r>
+        <w:rPr>
+          <w:rFonts w:ascii="Times New Roman" w:hAnsi="Times New Roman" w:cs="Times New Roman" w:hint="eastAsia"/>
+          <w:sz w:val="24"/>
+          <w:szCs w:val="24"/>
+        </w:rPr>
+        <w:t xml:space="preserve"> the sentence matches Question 3.</w:t>
+      </w:r>
+      <w:r>
+        <w:rPr>
+          <w:rFonts w:ascii="Times New Roman" w:hAnsi="Times New Roman" w:cs="Times New Roman" w:hint="eastAsia"/>
+          <w:sz w:val="24"/>
+          <w:szCs w:val="24"/>
+        </w:rPr>
+        <w:t xml:space="preserve"> Because </w:t>
+      </w:r>
+      <w:r>
+        <w:rPr>
+          <w:rFonts w:ascii="Times New Roman" w:hAnsi="Times New Roman" w:cs="Times New Roman" w:hint="eastAsia"/>
+          <w:sz w:val="24"/>
+          <w:szCs w:val="24"/>
+        </w:rPr>
+        <w:t xml:space="preserve">questions come in order in the </w:t>
+      </w:r>
+      <w:r>
+        <w:rPr>
+          <w:rFonts w:ascii="Times New Roman" w:hAnsi="Times New Roman" w:cs="Times New Roman" w:hint="eastAsia"/>
+          <w:sz w:val="24"/>
+          <w:szCs w:val="24"/>
+        </w:rPr>
+        <w:t>passage</w:t>
+      </w:r>
+      <w:r>
+        <w:rPr>
+          <w:rFonts w:ascii="Times New Roman" w:hAnsi="Times New Roman" w:cs="Times New Roman" w:hint="eastAsia"/>
+          <w:sz w:val="24"/>
+          <w:szCs w:val="24"/>
+        </w:rPr>
+        <w:t xml:space="preserve"> so </w:t>
+      </w:r>
+      <w:r>
+        <w:rPr>
+          <w:rFonts w:ascii="Times New Roman" w:hAnsi="Times New Roman" w:cs="Times New Roman" w:hint="eastAsia"/>
+          <w:sz w:val="24"/>
+          <w:szCs w:val="24"/>
+        </w:rPr>
+        <w:t>NO.2 is between NO.1 and NO.3.</w:t>
+      </w:r>
+      <w:r>
+        <w:rPr>
+          <w:rFonts w:ascii="Times New Roman" w:hAnsi="Times New Roman" w:cs="Times New Roman" w:hint="eastAsia"/>
+          <w:sz w:val="24"/>
+          <w:szCs w:val="24"/>
+        </w:rPr>
+        <w:t xml:space="preserve"> </w:t>
+      </w:r>
+      <w:r>
+        <w:rPr>
+          <w:rFonts w:ascii="Times New Roman" w:hAnsi="Times New Roman" w:cs="Times New Roman" w:hint="eastAsia"/>
+          <w:sz w:val="24"/>
+          <w:szCs w:val="24"/>
+        </w:rPr>
+        <w:t xml:space="preserve">This is such an important tip especially when there is an NOT GIVEN statement. </w:t>
       </w:r>
     </w:p>
     <w:p>
@@ -5794,115 +5922,116 @@
       </w:pPr>
       <w:r>
         <w:rPr>
-          <w:rFonts w:ascii="Times New Roman" w:hAnsi="Times New Roman" w:cs="Times New Roman" w:hint="eastAsia"/>
-          <w:sz w:val="24"/>
-          <w:szCs w:val="24"/>
-        </w:rPr>
-        <w:t xml:space="preserve">Pay attention to the next question. If the </w:t>
-      </w:r>
-      <w:r>
-        <w:rPr>
-          <w:rFonts w:ascii="Times New Roman" w:hAnsi="Times New Roman" w:cs="Times New Roman" w:hint="eastAsia"/>
-          <w:sz w:val="24"/>
-          <w:szCs w:val="24"/>
-        </w:rPr>
-        <w:t xml:space="preserve">answer of </w:t>
-      </w:r>
-      <w:r>
-        <w:rPr>
-          <w:rFonts w:ascii="Times New Roman" w:hAnsi="Times New Roman" w:cs="Times New Roman" w:hint="eastAsia"/>
-          <w:sz w:val="24"/>
-          <w:szCs w:val="24"/>
-        </w:rPr>
-        <w:t xml:space="preserve">Question 2 were not </w:t>
-      </w:r>
-      <w:r>
-        <w:rPr>
-          <w:rFonts w:ascii="Times New Roman" w:hAnsi="Times New Roman" w:cs="Times New Roman" w:hint="eastAsia"/>
-          <w:sz w:val="24"/>
-          <w:szCs w:val="24"/>
-        </w:rPr>
-        <w:t>found</w:t>
-      </w:r>
-      <w:r>
-        <w:rPr>
-          <w:rFonts w:ascii="Times New Roman" w:hAnsi="Times New Roman" w:cs="Times New Roman" w:hint="eastAsia"/>
-          <w:sz w:val="24"/>
-          <w:szCs w:val="24"/>
-        </w:rPr>
-        <w:t>, don</w:t>
-      </w:r>
-      <w:r>
-        <w:rPr>
-          <w:rFonts w:ascii="Times New Roman" w:hAnsi="Times New Roman" w:cs="Times New Roman"/>
-          <w:sz w:val="24"/>
-          <w:szCs w:val="24"/>
-        </w:rPr>
-        <w:t>’</w:t>
-      </w:r>
-      <w:r>
-        <w:rPr>
-          <w:rFonts w:ascii="Times New Roman" w:hAnsi="Times New Roman" w:cs="Times New Roman" w:hint="eastAsia"/>
-          <w:sz w:val="24"/>
-          <w:szCs w:val="24"/>
-        </w:rPr>
-        <w:t xml:space="preserve">t </w:t>
-      </w:r>
-      <w:r>
-        <w:rPr>
-          <w:rFonts w:ascii="Times New Roman" w:hAnsi="Times New Roman" w:cs="Times New Roman" w:hint="eastAsia"/>
-          <w:sz w:val="24"/>
-          <w:szCs w:val="24"/>
-        </w:rPr>
-        <w:t>read through all the passage to find an answer but</w:t>
-      </w:r>
-      <w:r>
-        <w:rPr>
-          <w:rFonts w:ascii="Times New Roman" w:hAnsi="Times New Roman" w:cs="Times New Roman" w:hint="eastAsia"/>
-          <w:sz w:val="24"/>
-          <w:szCs w:val="24"/>
-        </w:rPr>
-        <w:t xml:space="preserve"> stop </w:t>
-      </w:r>
-      <w:r>
-        <w:rPr>
-          <w:rFonts w:ascii="Times New Roman" w:hAnsi="Times New Roman" w:cs="Times New Roman" w:hint="eastAsia"/>
-          <w:sz w:val="24"/>
-          <w:szCs w:val="24"/>
-        </w:rPr>
-        <w:t>at</w:t>
-      </w:r>
-      <w:r>
-        <w:rPr>
-          <w:rFonts w:ascii="Times New Roman" w:hAnsi="Times New Roman" w:cs="Times New Roman" w:hint="eastAsia"/>
-          <w:sz w:val="24"/>
-          <w:szCs w:val="24"/>
-        </w:rPr>
-        <w:t xml:space="preserve"> the sentence matches Question 3.</w:t>
-      </w:r>
-      <w:r>
-        <w:rPr>
-          <w:rFonts w:ascii="Times New Roman" w:hAnsi="Times New Roman" w:cs="Times New Roman" w:hint="eastAsia"/>
-          <w:sz w:val="24"/>
-          <w:szCs w:val="24"/>
-        </w:rPr>
-        <w:t xml:space="preserve"> Because </w:t>
-      </w:r>
-      <w:r>
-        <w:rPr>
-          <w:rFonts w:ascii="Times New Roman" w:hAnsi="Times New Roman" w:cs="Times New Roman" w:hint="eastAsia"/>
-          <w:sz w:val="24"/>
-          <w:szCs w:val="24"/>
-        </w:rPr>
-        <w:t xml:space="preserve">questions come in order in the articles so </w:t>
-      </w:r>
-      <w:r>
-        <w:rPr>
-          <w:rFonts w:ascii="Times New Roman" w:hAnsi="Times New Roman" w:cs="Times New Roman" w:hint="eastAsia"/>
-          <w:sz w:val="24"/>
-          <w:szCs w:val="24"/>
-        </w:rPr>
-        <w:t>NO.2 is between NO.1 and NO.3.</w:t>
+          <w:rFonts w:ascii="Times New Roman" w:hAnsi="Times New Roman" w:cs="Times New Roman"/>
+          <w:sz w:val="24"/>
+          <w:szCs w:val="24"/>
+        </w:rPr>
+        <w:t>“</w:t>
+      </w:r>
+      <w:r>
+        <w:rPr>
+          <w:rFonts w:ascii="Times New Roman" w:hAnsi="Times New Roman" w:cs="Times New Roman" w:hint="eastAsia"/>
+          <w:sz w:val="24"/>
+          <w:szCs w:val="24"/>
+        </w:rPr>
+        <w:t>True</w:t>
+      </w:r>
+      <w:r>
+        <w:rPr>
+          <w:rFonts w:ascii="Times New Roman" w:hAnsi="Times New Roman" w:cs="Times New Roman"/>
+          <w:sz w:val="24"/>
+          <w:szCs w:val="24"/>
+        </w:rPr>
+        <w:t>”</w:t>
+      </w:r>
+      <w:r>
+        <w:rPr>
+          <w:rFonts w:ascii="Times New Roman" w:hAnsi="Times New Roman" w:cs="Times New Roman" w:hint="eastAsia"/>
+          <w:sz w:val="24"/>
+          <w:szCs w:val="24"/>
+        </w:rPr>
+        <w:t xml:space="preserve"> means that the anwer share the same points as the statement in the </w:t>
+      </w:r>
+      <w:r>
+        <w:rPr>
+          <w:rFonts w:ascii="Times New Roman" w:hAnsi="Times New Roman" w:cs="Times New Roman" w:hint="eastAsia"/>
+          <w:sz w:val="24"/>
+          <w:szCs w:val="24"/>
+        </w:rPr>
+        <w:lastRenderedPageBreak/>
+        <w:t xml:space="preserve">passage. </w:t>
+      </w:r>
+      <w:r>
+        <w:rPr>
+          <w:rFonts w:ascii="Times New Roman" w:hAnsi="Times New Roman" w:cs="Times New Roman"/>
+          <w:sz w:val="24"/>
+          <w:szCs w:val="24"/>
+        </w:rPr>
+        <w:t>“</w:t>
+      </w:r>
+      <w:r>
+        <w:rPr>
+          <w:rFonts w:ascii="Times New Roman" w:hAnsi="Times New Roman" w:cs="Times New Roman" w:hint="eastAsia"/>
+          <w:sz w:val="24"/>
+          <w:szCs w:val="24"/>
+        </w:rPr>
+        <w:t>False</w:t>
+      </w:r>
+      <w:r>
+        <w:rPr>
+          <w:rFonts w:ascii="Times New Roman" w:hAnsi="Times New Roman" w:cs="Times New Roman"/>
+          <w:sz w:val="24"/>
+          <w:szCs w:val="24"/>
+        </w:rPr>
+        <w:t>”</w:t>
+      </w:r>
+      <w:r>
+        <w:rPr>
+          <w:rFonts w:ascii="Times New Roman" w:hAnsi="Times New Roman" w:cs="Times New Roman" w:hint="eastAsia"/>
+          <w:sz w:val="24"/>
+          <w:szCs w:val="24"/>
+        </w:rPr>
+        <w:t xml:space="preserve"> means opposite/controdict so it neither close nor near but far from it. </w:t>
+      </w:r>
+      <w:r>
+        <w:rPr>
+          <w:rFonts w:ascii="Times New Roman" w:hAnsi="Times New Roman" w:cs="Times New Roman" w:hint="eastAsia"/>
+          <w:sz w:val="24"/>
+          <w:szCs w:val="24"/>
+        </w:rPr>
+        <w:t xml:space="preserve">As in the following example, </w:t>
+      </w:r>
+      <w:r>
+        <w:rPr>
+          <w:rFonts w:ascii="Times New Roman" w:hAnsi="Times New Roman" w:cs="Times New Roman"/>
+          <w:sz w:val="24"/>
+          <w:szCs w:val="24"/>
+        </w:rPr>
+        <w:t>“</w:t>
+      </w:r>
+      <w:r>
+        <w:rPr>
+          <w:rFonts w:ascii="Times New Roman" w:hAnsi="Times New Roman" w:cs="Times New Roman" w:hint="eastAsia"/>
+          <w:sz w:val="24"/>
+          <w:szCs w:val="24"/>
+        </w:rPr>
+        <w:t>about</w:t>
+      </w:r>
+      <w:r>
+        <w:rPr>
+          <w:rFonts w:ascii="Times New Roman" w:hAnsi="Times New Roman" w:cs="Times New Roman"/>
+          <w:sz w:val="24"/>
+          <w:szCs w:val="24"/>
+        </w:rPr>
+        <w:t>”</w:t>
+      </w:r>
+      <w:r>
+        <w:rPr>
+          <w:rFonts w:ascii="Times New Roman" w:hAnsi="Times New Roman" w:cs="Times New Roman" w:hint="eastAsia"/>
+          <w:sz w:val="24"/>
+          <w:szCs w:val="24"/>
+        </w:rPr>
+        <w:t xml:space="preserve"> means a little bit more or less, so it is true.</w:t>
       </w:r>
       <w:r>
         <w:rPr>
@@ -5918,7 +6047,146 @@
           <w:sz w:val="24"/>
           <w:szCs w:val="24"/>
         </w:rPr>
-        <w:t xml:space="preserve"> </w:t>
+        <w:t>Focus on adjectives and adverbs which can be different in their meanings.</w:t>
+      </w:r>
+    </w:p>
+    <w:p>
+      <w:pPr>
+        <w:pStyle w:val="a3"/>
+        <w:ind w:left="1080" w:firstLineChars="0" w:firstLine="0"/>
+        <w:rPr>
+          <w:rFonts w:ascii="Times New Roman" w:hAnsi="Times New Roman" w:cs="Times New Roman"/>
+          <w:i/>
+          <w:sz w:val="24"/>
+          <w:szCs w:val="24"/>
+        </w:rPr>
+      </w:pPr>
+      <w:r>
+        <w:rPr>
+          <w:rFonts w:ascii="Times New Roman" w:hAnsi="Times New Roman" w:cs="Times New Roman" w:hint="eastAsia"/>
+          <w:sz w:val="24"/>
+          <w:szCs w:val="24"/>
+        </w:rPr>
+        <w:t>An Example:</w:t>
+      </w:r>
+      <w:r>
+        <w:rPr>
+          <w:rFonts w:ascii="Times New Roman" w:hAnsi="Times New Roman" w:cs="Times New Roman"/>
+          <w:sz w:val="24"/>
+          <w:szCs w:val="24"/>
+        </w:rPr>
+        <w:br/>
+      </w:r>
+      <w:r>
+        <w:rPr>
+          <w:rFonts w:ascii="Times New Roman" w:hAnsi="Times New Roman" w:cs="Times New Roman" w:hint="eastAsia"/>
+          <w:i/>
+          <w:sz w:val="24"/>
+          <w:szCs w:val="24"/>
+        </w:rPr>
+        <w:t>Passag</w:t>
+      </w:r>
+      <w:r>
+        <w:rPr>
+          <w:rFonts w:ascii="Times New Roman" w:hAnsi="Times New Roman" w:cs="Times New Roman" w:hint="eastAsia"/>
+          <w:i/>
+          <w:sz w:val="24"/>
+          <w:szCs w:val="24"/>
+        </w:rPr>
+        <w:t>e</w:t>
+      </w:r>
+      <w:r>
+        <w:rPr>
+          <w:rFonts w:ascii="Times New Roman" w:hAnsi="Times New Roman" w:cs="Times New Roman" w:hint="eastAsia"/>
+          <w:i/>
+          <w:sz w:val="24"/>
+          <w:szCs w:val="24"/>
+        </w:rPr>
+        <w:t xml:space="preserve"> : </w:t>
+      </w:r>
+    </w:p>
+    <w:p>
+      <w:pPr>
+        <w:pStyle w:val="a3"/>
+        <w:ind w:left="1080" w:firstLineChars="0" w:firstLine="0"/>
+        <w:rPr>
+          <w:rFonts w:ascii="Times New Roman" w:hAnsi="Times New Roman" w:cs="Times New Roman"/>
+          <w:sz w:val="24"/>
+          <w:szCs w:val="24"/>
+        </w:rPr>
+      </w:pPr>
+      <w:r>
+        <w:rPr>
+          <w:rFonts w:ascii="Times New Roman" w:hAnsi="Times New Roman" w:cs="Times New Roman" w:hint="eastAsia"/>
+          <w:sz w:val="24"/>
+          <w:szCs w:val="24"/>
+        </w:rPr>
+        <w:t>Just over 400 million acres of land is being used for agriculture in America.</w:t>
+      </w:r>
+    </w:p>
+    <w:p>
+      <w:pPr>
+        <w:pStyle w:val="a3"/>
+        <w:ind w:left="1080" w:firstLineChars="0" w:firstLine="0"/>
+        <w:rPr>
+          <w:rFonts w:ascii="Times New Roman" w:hAnsi="Times New Roman" w:cs="Times New Roman"/>
+          <w:i/>
+          <w:sz w:val="24"/>
+          <w:szCs w:val="24"/>
+        </w:rPr>
+      </w:pPr>
+      <w:r>
+        <w:rPr>
+          <w:rFonts w:ascii="Times New Roman" w:hAnsi="Times New Roman" w:cs="Times New Roman" w:hint="eastAsia"/>
+          <w:i/>
+          <w:sz w:val="24"/>
+          <w:szCs w:val="24"/>
+        </w:rPr>
+        <w:t>Question:</w:t>
+      </w:r>
+    </w:p>
+    <w:p>
+      <w:pPr>
+        <w:pStyle w:val="a3"/>
+        <w:ind w:left="1080" w:firstLineChars="0" w:firstLine="0"/>
+        <w:rPr>
+          <w:rFonts w:ascii="Times New Roman" w:hAnsi="Times New Roman" w:cs="Times New Roman"/>
+          <w:sz w:val="24"/>
+          <w:szCs w:val="24"/>
+        </w:rPr>
+      </w:pPr>
+      <w:r>
+        <w:rPr>
+          <w:rFonts w:ascii="Times New Roman" w:hAnsi="Times New Roman" w:cs="Times New Roman" w:hint="eastAsia"/>
+          <w:sz w:val="24"/>
+          <w:szCs w:val="24"/>
+        </w:rPr>
+        <w:t xml:space="preserve">At present, in America, </w:t>
+      </w:r>
+      <w:r>
+        <w:rPr>
+          <w:rFonts w:ascii="Times New Roman" w:hAnsi="Times New Roman" w:cs="Times New Roman" w:hint="eastAsia"/>
+          <w:b/>
+          <w:sz w:val="24"/>
+          <w:szCs w:val="24"/>
+        </w:rPr>
+        <w:t>about</w:t>
+      </w:r>
+      <w:r>
+        <w:rPr>
+          <w:rFonts w:ascii="Times New Roman" w:hAnsi="Times New Roman" w:cs="Times New Roman" w:hint="eastAsia"/>
+          <w:sz w:val="24"/>
+          <w:szCs w:val="24"/>
+        </w:rPr>
+        <w:t xml:space="preserve"> 400 million acres of land is allocated for agriculture.</w:t>
+      </w:r>
+      <w:r>
+        <w:rPr>
+          <w:rFonts w:ascii="Times New Roman" w:hAnsi="Times New Roman" w:cs="Times New Roman" w:hint="eastAsia"/>
+          <w:sz w:val="24"/>
+          <w:szCs w:val="24"/>
+        </w:rPr>
+        <w:t xml:space="preserve">  (TRUE)</w:t>
       </w:r>
     </w:p>
     <w:p>
@@ -5937,273 +6205,19 @@
       </w:pPr>
       <w:r>
         <w:rPr>
-          <w:rFonts w:ascii="Times New Roman" w:hAnsi="Times New Roman" w:cs="Times New Roman"/>
-          <w:sz w:val="24"/>
-          <w:szCs w:val="24"/>
-        </w:rPr>
-        <w:t>“</w:t>
-      </w:r>
-      <w:r>
-        <w:rPr>
-          <w:rFonts w:ascii="Times New Roman" w:hAnsi="Times New Roman" w:cs="Times New Roman" w:hint="eastAsia"/>
-          <w:sz w:val="24"/>
-          <w:szCs w:val="24"/>
-        </w:rPr>
-        <w:t>True</w:t>
-      </w:r>
-      <w:r>
-        <w:rPr>
-          <w:rFonts w:ascii="Times New Roman" w:hAnsi="Times New Roman" w:cs="Times New Roman"/>
-          <w:sz w:val="24"/>
-          <w:szCs w:val="24"/>
-        </w:rPr>
-        <w:t>”</w:t>
-      </w:r>
-      <w:r>
-        <w:rPr>
-          <w:rFonts w:ascii="Times New Roman" w:hAnsi="Times New Roman" w:cs="Times New Roman" w:hint="eastAsia"/>
-          <w:sz w:val="24"/>
-          <w:szCs w:val="24"/>
-        </w:rPr>
-        <w:t xml:space="preserve"> means that the anwer share the same points as the statement in the passage. </w:t>
-      </w:r>
-      <w:r>
-        <w:rPr>
-          <w:rFonts w:ascii="Times New Roman" w:hAnsi="Times New Roman" w:cs="Times New Roman"/>
-          <w:sz w:val="24"/>
-          <w:szCs w:val="24"/>
-        </w:rPr>
-        <w:t>“</w:t>
-      </w:r>
-      <w:r>
-        <w:rPr>
-          <w:rFonts w:ascii="Times New Roman" w:hAnsi="Times New Roman" w:cs="Times New Roman" w:hint="eastAsia"/>
-          <w:sz w:val="24"/>
-          <w:szCs w:val="24"/>
-        </w:rPr>
-        <w:t>False</w:t>
-      </w:r>
-      <w:r>
-        <w:rPr>
-          <w:rFonts w:ascii="Times New Roman" w:hAnsi="Times New Roman" w:cs="Times New Roman"/>
-          <w:sz w:val="24"/>
-          <w:szCs w:val="24"/>
-        </w:rPr>
-        <w:t>”</w:t>
-      </w:r>
-      <w:r>
-        <w:rPr>
-          <w:rFonts w:ascii="Times New Roman" w:hAnsi="Times New Roman" w:cs="Times New Roman" w:hint="eastAsia"/>
-          <w:sz w:val="24"/>
-          <w:szCs w:val="24"/>
-        </w:rPr>
-        <w:t xml:space="preserve"> means opposite/controdict so it neither close nor near but </w:t>
-      </w:r>
-      <w:r>
-        <w:rPr>
-          <w:rFonts w:ascii="Times New Roman" w:hAnsi="Times New Roman" w:cs="Times New Roman" w:hint="eastAsia"/>
-          <w:sz w:val="24"/>
-          <w:szCs w:val="24"/>
-        </w:rPr>
-        <w:lastRenderedPageBreak/>
-        <w:t xml:space="preserve">far from it. </w:t>
-      </w:r>
-      <w:r>
-        <w:rPr>
-          <w:rFonts w:ascii="Times New Roman" w:hAnsi="Times New Roman" w:cs="Times New Roman" w:hint="eastAsia"/>
-          <w:sz w:val="24"/>
-          <w:szCs w:val="24"/>
-        </w:rPr>
-        <w:t xml:space="preserve">As in the following example, </w:t>
-      </w:r>
-      <w:r>
-        <w:rPr>
-          <w:rFonts w:ascii="Times New Roman" w:hAnsi="Times New Roman" w:cs="Times New Roman"/>
-          <w:sz w:val="24"/>
-          <w:szCs w:val="24"/>
-        </w:rPr>
-        <w:t>“</w:t>
-      </w:r>
-      <w:r>
-        <w:rPr>
-          <w:rFonts w:ascii="Times New Roman" w:hAnsi="Times New Roman" w:cs="Times New Roman" w:hint="eastAsia"/>
-          <w:sz w:val="24"/>
-          <w:szCs w:val="24"/>
-        </w:rPr>
-        <w:t>about</w:t>
-      </w:r>
-      <w:r>
-        <w:rPr>
-          <w:rFonts w:ascii="Times New Roman" w:hAnsi="Times New Roman" w:cs="Times New Roman"/>
-          <w:sz w:val="24"/>
-          <w:szCs w:val="24"/>
-        </w:rPr>
-        <w:t>”</w:t>
-      </w:r>
-      <w:r>
-        <w:rPr>
-          <w:rFonts w:ascii="Times New Roman" w:hAnsi="Times New Roman" w:cs="Times New Roman" w:hint="eastAsia"/>
-          <w:sz w:val="24"/>
-          <w:szCs w:val="24"/>
-        </w:rPr>
-        <w:t xml:space="preserve"> means a little bit more or less, so it is true.</w:t>
-      </w:r>
-      <w:r>
-        <w:rPr>
-          <w:rFonts w:ascii="Times New Roman" w:hAnsi="Times New Roman" w:cs="Times New Roman" w:hint="eastAsia"/>
-          <w:sz w:val="24"/>
-          <w:szCs w:val="24"/>
-        </w:rPr>
-        <w:t xml:space="preserve"> </w:t>
-      </w:r>
-      <w:r>
-        <w:rPr>
-          <w:rFonts w:ascii="Times New Roman" w:hAnsi="Times New Roman" w:cs="Times New Roman" w:hint="eastAsia"/>
-          <w:sz w:val="24"/>
-          <w:szCs w:val="24"/>
-        </w:rPr>
-        <w:t>Focus on adjectives and adverbs which can be different in their meanings.</w:t>
-      </w:r>
-    </w:p>
-    <w:p>
-      <w:pPr>
-        <w:pStyle w:val="a3"/>
-        <w:ind w:left="1080" w:firstLineChars="0" w:firstLine="0"/>
-        <w:rPr>
-          <w:rFonts w:ascii="Times New Roman" w:hAnsi="Times New Roman" w:cs="Times New Roman"/>
-          <w:i/>
-          <w:sz w:val="24"/>
-          <w:szCs w:val="24"/>
-        </w:rPr>
-      </w:pPr>
-      <w:r>
-        <w:rPr>
-          <w:rFonts w:ascii="Times New Roman" w:hAnsi="Times New Roman" w:cs="Times New Roman" w:hint="eastAsia"/>
-          <w:sz w:val="24"/>
-          <w:szCs w:val="24"/>
-        </w:rPr>
-        <w:t>An Example:</w:t>
-      </w:r>
-      <w:r>
-        <w:rPr>
-          <w:rFonts w:ascii="Times New Roman" w:hAnsi="Times New Roman" w:cs="Times New Roman"/>
-          <w:sz w:val="24"/>
-          <w:szCs w:val="24"/>
-        </w:rPr>
-        <w:br/>
-      </w:r>
-      <w:r>
-        <w:rPr>
-          <w:rFonts w:ascii="Times New Roman" w:hAnsi="Times New Roman" w:cs="Times New Roman" w:hint="eastAsia"/>
-          <w:i/>
-          <w:sz w:val="24"/>
-          <w:szCs w:val="24"/>
-        </w:rPr>
-        <w:t>Passag</w:t>
-      </w:r>
-      <w:r>
-        <w:rPr>
-          <w:rFonts w:ascii="Times New Roman" w:hAnsi="Times New Roman" w:cs="Times New Roman" w:hint="eastAsia"/>
-          <w:i/>
-          <w:sz w:val="24"/>
-          <w:szCs w:val="24"/>
-        </w:rPr>
-        <w:t>e</w:t>
-      </w:r>
-      <w:bookmarkStart w:id="0" w:name="_GoBack"/>
-      <w:bookmarkEnd w:id="0"/>
-      <w:r>
-        <w:rPr>
-          <w:rFonts w:ascii="Times New Roman" w:hAnsi="Times New Roman" w:cs="Times New Roman" w:hint="eastAsia"/>
-          <w:i/>
-          <w:sz w:val="24"/>
-          <w:szCs w:val="24"/>
-        </w:rPr>
-        <w:t xml:space="preserve"> : </w:t>
-      </w:r>
-    </w:p>
-    <w:p>
-      <w:pPr>
-        <w:pStyle w:val="a3"/>
-        <w:ind w:left="1080" w:firstLineChars="0" w:firstLine="0"/>
-        <w:rPr>
-          <w:rFonts w:ascii="Times New Roman" w:hAnsi="Times New Roman" w:cs="Times New Roman"/>
-          <w:sz w:val="24"/>
-          <w:szCs w:val="24"/>
-        </w:rPr>
-      </w:pPr>
-      <w:r>
-        <w:rPr>
-          <w:rFonts w:ascii="Times New Roman" w:hAnsi="Times New Roman" w:cs="Times New Roman" w:hint="eastAsia"/>
-          <w:sz w:val="24"/>
-          <w:szCs w:val="24"/>
-        </w:rPr>
-        <w:t>Just over 400 million acres of land is being used for agriculture in America.</w:t>
-      </w:r>
-    </w:p>
-    <w:p>
-      <w:pPr>
-        <w:pStyle w:val="a3"/>
-        <w:ind w:left="1080" w:firstLineChars="0" w:firstLine="0"/>
-        <w:rPr>
-          <w:rFonts w:ascii="Times New Roman" w:hAnsi="Times New Roman" w:cs="Times New Roman"/>
-          <w:i/>
-          <w:sz w:val="24"/>
-          <w:szCs w:val="24"/>
-        </w:rPr>
-      </w:pPr>
-      <w:r>
-        <w:rPr>
-          <w:rFonts w:ascii="Times New Roman" w:hAnsi="Times New Roman" w:cs="Times New Roman" w:hint="eastAsia"/>
-          <w:i/>
-          <w:sz w:val="24"/>
-          <w:szCs w:val="24"/>
-        </w:rPr>
-        <w:t>Question:</w:t>
-      </w:r>
-    </w:p>
-    <w:p>
-      <w:pPr>
-        <w:pStyle w:val="a3"/>
-        <w:ind w:left="1080" w:firstLineChars="0" w:firstLine="0"/>
-        <w:rPr>
-          <w:rFonts w:ascii="Times New Roman" w:hAnsi="Times New Roman" w:cs="Times New Roman"/>
-          <w:sz w:val="24"/>
-          <w:szCs w:val="24"/>
-        </w:rPr>
-      </w:pPr>
-      <w:r>
-        <w:rPr>
-          <w:rFonts w:ascii="Times New Roman" w:hAnsi="Times New Roman" w:cs="Times New Roman" w:hint="eastAsia"/>
-          <w:sz w:val="24"/>
-          <w:szCs w:val="24"/>
-        </w:rPr>
-        <w:t xml:space="preserve">At present, in America, </w:t>
-      </w:r>
-      <w:r>
-        <w:rPr>
-          <w:rFonts w:ascii="Times New Roman" w:hAnsi="Times New Roman" w:cs="Times New Roman" w:hint="eastAsia"/>
-          <w:b/>
-          <w:sz w:val="24"/>
-          <w:szCs w:val="24"/>
-        </w:rPr>
-        <w:t>about</w:t>
-      </w:r>
-      <w:r>
-        <w:rPr>
-          <w:rFonts w:ascii="Times New Roman" w:hAnsi="Times New Roman" w:cs="Times New Roman" w:hint="eastAsia"/>
-          <w:sz w:val="24"/>
-          <w:szCs w:val="24"/>
-        </w:rPr>
-        <w:t xml:space="preserve"> 400 million acres of land is allocated for agriculture.</w:t>
-      </w:r>
-      <w:r>
-        <w:rPr>
-          <w:rFonts w:ascii="Times New Roman" w:hAnsi="Times New Roman" w:cs="Times New Roman" w:hint="eastAsia"/>
-          <w:sz w:val="24"/>
-          <w:szCs w:val="24"/>
-        </w:rPr>
-        <w:t xml:space="preserve">  (TRUE)</w:t>
+          <w:rFonts w:ascii="Times New Roman" w:hAnsi="Times New Roman" w:cs="Times New Roman" w:hint="eastAsia"/>
+          <w:sz w:val="24"/>
+          <w:szCs w:val="24"/>
+        </w:rPr>
+        <w:t>Time man</w:t>
+      </w:r>
+      <w:r>
+        <w:rPr>
+          <w:rFonts w:ascii="Times New Roman" w:hAnsi="Times New Roman" w:cs="Times New Roman" w:hint="eastAsia"/>
+          <w:sz w:val="24"/>
+          <w:szCs w:val="24"/>
+        </w:rPr>
+        <w:t>agement is critically important because there would not be enough time for you to complete all the questions if you were reading too slow.</w:t>
       </w:r>
     </w:p>
     <w:p>
@@ -6226,15 +6240,7 @@
           <w:sz w:val="24"/>
           <w:szCs w:val="24"/>
         </w:rPr>
-        <w:t>Time man</w:t>
-      </w:r>
-      <w:r>
-        <w:rPr>
-          <w:rFonts w:ascii="Times New Roman" w:hAnsi="Times New Roman" w:cs="Times New Roman" w:hint="eastAsia"/>
-          <w:sz w:val="24"/>
-          <w:szCs w:val="24"/>
-        </w:rPr>
-        <w:t>agement is critically important because there would not be enough time for you to complete all the questions if you were reading too slow.</w:t>
+        <w:t xml:space="preserve">Do not try to match key words, but match meaning of them. </w:t>
       </w:r>
     </w:p>
     <w:p>
@@ -6303,7 +6309,7 @@
           <w:sz w:val="24"/>
           <w:szCs w:val="24"/>
         </w:rPr>
-        <w:t>Don’t use repeat words.</w:t>
+        <w:t>Don’t repeat words.</w:t>
       </w:r>
       <w:r>
         <w:rPr>
@@ -6919,6 +6925,8 @@
         </w:rPr>
         <w:t>The amount of rice increased.</w:t>
       </w:r>
+      <w:bookmarkStart w:id="0" w:name="_GoBack"/>
+      <w:bookmarkEnd w:id="0"/>
     </w:p>
     <w:p>
       <w:pPr>
@@ -6940,6 +6948,7 @@
           <w:sz w:val="24"/>
           <w:szCs w:val="24"/>
         </w:rPr>
+        <w:lastRenderedPageBreak/>
         <w:t>Try answering the question without </w:t>
       </w:r>
       <w:r>
@@ -7034,7 +7043,6 @@
           <w:sz w:val="24"/>
           <w:szCs w:val="24"/>
         </w:rPr>
-        <w:lastRenderedPageBreak/>
         <w:t xml:space="preserve">In writing task 2, </w:t>
       </w:r>
       <w:r>
@@ -8233,6 +8241,7 @@
           <w:szCs w:val="24"/>
           <w:lang w:val="en-GB"/>
         </w:rPr>
+        <w:lastRenderedPageBreak/>
         <w:t>First of all, you should analyse the task</w:t>
       </w:r>
       <w:r>
@@ -8260,17 +8269,7 @@
           <w:szCs w:val="24"/>
           <w:lang w:val="en-GB"/>
         </w:rPr>
-        <w:t xml:space="preserve"> So </w:t>
-      </w:r>
-      <w:r>
-        <w:rPr>
-          <w:rFonts w:ascii="Times New Roman" w:hAnsi="Times New Roman" w:cs="Times New Roman" w:hint="eastAsia"/>
-          <w:sz w:val="24"/>
-          <w:szCs w:val="24"/>
-          <w:lang w:val="en-GB"/>
-        </w:rPr>
-        <w:lastRenderedPageBreak/>
-        <w:t>it is worth your ti</w:t>
+        <w:t xml:space="preserve"> So it is worth your ti</w:t>
       </w:r>
       <w:r>
         <w:rPr>
@@ -9246,7 +9245,6 @@
           <w:szCs w:val="24"/>
           <w:lang w:val="en-GB"/>
         </w:rPr>
-        <w:lastRenderedPageBreak/>
         <w:t xml:space="preserve">How to describe a map for academic task 1? </w:t>
       </w:r>
     </w:p>
@@ -10087,7 +10085,16 @@
           <w:sz w:val="24"/>
           <w:szCs w:val="24"/>
         </w:rPr>
-        <w:t xml:space="preserve"> It is said that if you aim at star</w:t>
+        <w:t xml:space="preserve"> It is said that if you </w:t>
+      </w:r>
+      <w:r>
+        <w:rPr>
+          <w:rFonts w:ascii="Times New Roman" w:hAnsi="Times New Roman" w:cs="Times New Roman"/>
+          <w:sz w:val="24"/>
+          <w:szCs w:val="24"/>
+        </w:rPr>
+        <w:lastRenderedPageBreak/>
+        <w:t>aim at star</w:t>
       </w:r>
       <w:r>
         <w:rPr>
@@ -10146,16 +10153,7 @@
           <w:sz w:val="24"/>
           <w:szCs w:val="24"/>
         </w:rPr>
-        <w:t xml:space="preserve">4. Take at least one full test at home before sitting a real IELTS test. You had </w:t>
-      </w:r>
-      <w:r>
-        <w:rPr>
-          <w:rFonts w:ascii="Times New Roman" w:hAnsi="Times New Roman" w:cs="Times New Roman" w:hint="eastAsia"/>
-          <w:sz w:val="24"/>
-          <w:szCs w:val="24"/>
-        </w:rPr>
-        <w:lastRenderedPageBreak/>
-        <w:t xml:space="preserve">better set a alarm and finish all the three tests except for speaking within 2 hours and 40 minutes. </w:t>
+        <w:t xml:space="preserve">4. Take at least one full test at home before sitting a real IELTS test. You had better set a alarm and finish all the three tests except for speaking within 2 hours and 40 minutes. </w:t>
       </w:r>
     </w:p>
     <w:p>
@@ -11510,6 +11508,7 @@
           <w:sz w:val="26"/>
           <w:szCs w:val="26"/>
         </w:rPr>
+        <w:lastRenderedPageBreak/>
         <w:t>Living in Cities</w:t>
       </w:r>
     </w:p>
@@ -11580,16 +11579,7 @@
           <w:sz w:val="24"/>
           <w:szCs w:val="24"/>
         </w:rPr>
-        <w:t xml:space="preserve"> appreciate the accessibility of </w:t>
-      </w:r>
-      <w:r>
-        <w:rPr>
-          <w:rFonts w:ascii="Times New Roman" w:hAnsi="Times New Roman" w:cs="Times New Roman"/>
-          <w:sz w:val="24"/>
-          <w:szCs w:val="24"/>
-        </w:rPr>
-        <w:lastRenderedPageBreak/>
-        <w:t>amenities, the cultural diversity and the range of employment opportunities available.</w:t>
+        <w:t xml:space="preserve"> appreciate the accessibility of amenities, the cultural diversity and the range of employment opportunities available.</w:t>
       </w:r>
     </w:p>
     <w:p>

</xml_diff>

<commit_message>
add notes of speaking
</commit_message>
<xml_diff>
--- a/IELTS Notes/Notes of IELTS.docx
+++ b/IELTS Notes/Notes of IELTS.docx
@@ -5172,7 +5172,7 @@
         </w:numPr>
         <w:ind w:firstLineChars="0"/>
         <w:rPr>
-          <w:rFonts w:ascii="Times New Roman" w:hAnsi="Times New Roman" w:cs="Times New Roman"/>
+          <w:rFonts w:ascii="Times New Roman" w:hAnsi="Times New Roman" w:cs="Times New Roman" w:hint="eastAsia"/>
           <w:sz w:val="24"/>
           <w:szCs w:val="24"/>
         </w:rPr>
@@ -5231,8 +5231,180 @@
           <w:sz w:val="24"/>
           <w:szCs w:val="24"/>
         </w:rPr>
-        <w:t xml:space="preserve">Use specific words instead of general ones. </w:t>
-      </w:r>
+        <w:t>Use specific words instead of general ones</w:t>
+      </w:r>
+    </w:p>
+    <w:p>
+      <w:pPr>
+        <w:pStyle w:val="a3"/>
+        <w:numPr>
+          <w:ilvl w:val="0"/>
+          <w:numId w:val="4"/>
+        </w:numPr>
+        <w:ind w:firstLineChars="0"/>
+        <w:rPr>
+          <w:rFonts w:ascii="Times New Roman" w:hAnsi="Times New Roman" w:cs="Times New Roman"/>
+          <w:sz w:val="24"/>
+          <w:szCs w:val="24"/>
+        </w:rPr>
+      </w:pPr>
+      <w:r>
+        <w:rPr>
+          <w:rFonts w:ascii="Times New Roman" w:hAnsi="Times New Roman" w:cs="Times New Roman"/>
+          <w:sz w:val="24"/>
+          <w:szCs w:val="24"/>
+        </w:rPr>
+        <w:t xml:space="preserve">Never use basic terms such as “nice”, “be” when you are in a speaking test. For example, </w:t>
+      </w:r>
+      <w:r>
+        <w:rPr>
+          <w:rFonts w:ascii="Times New Roman" w:hAnsi="Times New Roman" w:cs="Times New Roman"/>
+          <w:sz w:val="24"/>
+          <w:szCs w:val="24"/>
+        </w:rPr>
+        <w:br/>
+      </w:r>
+      <w:r>
+        <w:rPr>
+          <w:rFonts w:ascii="Times New Roman" w:hAnsi="Times New Roman" w:cs="Times New Roman" w:hint="eastAsia"/>
+          <w:sz w:val="24"/>
+          <w:szCs w:val="24"/>
+        </w:rPr>
+        <w:t>*</w:t>
+      </w:r>
+      <w:r>
+        <w:rPr>
+          <w:rFonts w:ascii="Times New Roman" w:hAnsi="Times New Roman" w:cs="Times New Roman"/>
+          <w:sz w:val="24"/>
+          <w:szCs w:val="24"/>
+        </w:rPr>
+        <w:t xml:space="preserve"> “It’s a nice building” could be replaced by </w:t>
+      </w:r>
+      <w:r>
+        <w:rPr>
+          <w:rFonts w:ascii="Times New Roman" w:hAnsi="Times New Roman" w:cs="Times New Roman"/>
+          <w:sz w:val="24"/>
+          <w:szCs w:val="24"/>
+        </w:rPr>
+        <w:br/>
+        <w:t xml:space="preserve">“The building has beautiful artichitecture”, </w:t>
+      </w:r>
+      <w:r>
+        <w:rPr>
+          <w:rFonts w:ascii="Times New Roman" w:hAnsi="Times New Roman" w:cs="Times New Roman"/>
+          <w:sz w:val="24"/>
+          <w:szCs w:val="24"/>
+        </w:rPr>
+        <w:br/>
+      </w:r>
+      <w:r>
+        <w:rPr>
+          <w:rFonts w:ascii="Times New Roman" w:hAnsi="Times New Roman" w:cs="Times New Roman" w:hint="eastAsia"/>
+          <w:sz w:val="24"/>
+          <w:szCs w:val="24"/>
+        </w:rPr>
+        <w:t>*</w:t>
+      </w:r>
+      <w:r>
+        <w:rPr>
+          <w:rFonts w:ascii="Times New Roman" w:hAnsi="Times New Roman" w:cs="Times New Roman"/>
+          <w:sz w:val="24"/>
+          <w:szCs w:val="24"/>
+        </w:rPr>
+        <w:t xml:space="preserve"> “We have nice friends” should be replaced by </w:t>
+      </w:r>
+      <w:r>
+        <w:rPr>
+          <w:rFonts w:ascii="Times New Roman" w:hAnsi="Times New Roman" w:cs="Times New Roman"/>
+          <w:sz w:val="24"/>
+          <w:szCs w:val="24"/>
+        </w:rPr>
+        <w:br/>
+        <w:t>“We have friends who are always there for us.”</w:t>
+      </w:r>
+      <w:r>
+        <w:rPr>
+          <w:rFonts w:ascii="Times New Roman" w:hAnsi="Times New Roman" w:cs="Times New Roman"/>
+          <w:sz w:val="24"/>
+          <w:szCs w:val="24"/>
+        </w:rPr>
+        <w:br/>
+        <w:t>“I love mathematics because it is a nice school subject” is replaced by</w:t>
+      </w:r>
+      <w:r>
+        <w:rPr>
+          <w:rFonts w:ascii="Times New Roman" w:hAnsi="Times New Roman" w:cs="Times New Roman"/>
+          <w:sz w:val="24"/>
+          <w:szCs w:val="24"/>
+        </w:rPr>
+        <w:br/>
+        <w:t xml:space="preserve">“My most favourite school subject is geography.” </w:t>
+      </w:r>
+    </w:p>
+    <w:p>
+      <w:pPr>
+        <w:pStyle w:val="a3"/>
+        <w:numPr>
+          <w:ilvl w:val="0"/>
+          <w:numId w:val="20"/>
+        </w:numPr>
+        <w:ind w:firstLineChars="0"/>
+        <w:rPr>
+          <w:rFonts w:ascii="Times New Roman" w:hAnsi="Times New Roman" w:cs="Times New Roman"/>
+          <w:sz w:val="24"/>
+          <w:szCs w:val="24"/>
+        </w:rPr>
+      </w:pPr>
+      <w:r>
+        <w:rPr>
+          <w:rFonts w:ascii="Times New Roman" w:hAnsi="Times New Roman" w:cs="Times New Roman"/>
+          <w:sz w:val="24"/>
+          <w:szCs w:val="24"/>
+        </w:rPr>
+        <w:t>“I was in an interview yesterday.”</w:t>
+      </w:r>
+      <w:r>
+        <w:rPr>
+          <w:rFonts w:ascii="Times New Roman" w:hAnsi="Times New Roman" w:cs="Times New Roman" w:hint="eastAsia"/>
+          <w:sz w:val="24"/>
+          <w:szCs w:val="24"/>
+        </w:rPr>
+        <w:t xml:space="preserve"> </w:t>
+      </w:r>
+    </w:p>
+    <w:p>
+      <w:pPr>
+        <w:pStyle w:val="a3"/>
+        <w:ind w:left="1080" w:firstLineChars="0" w:firstLine="0"/>
+        <w:rPr>
+          <w:rFonts w:ascii="Times New Roman" w:hAnsi="Times New Roman" w:cs="Times New Roman"/>
+          <w:sz w:val="24"/>
+          <w:szCs w:val="24"/>
+        </w:rPr>
+      </w:pPr>
+      <w:r>
+        <w:rPr>
+          <w:rFonts w:ascii="Times New Roman" w:hAnsi="Times New Roman" w:cs="Times New Roman"/>
+          <w:sz w:val="24"/>
+          <w:szCs w:val="24"/>
+        </w:rPr>
+        <w:t>“I participated an interview yesterday.”</w:t>
+      </w:r>
+    </w:p>
+    <w:p>
+      <w:pPr>
+        <w:pStyle w:val="a3"/>
+        <w:numPr>
+          <w:ilvl w:val="0"/>
+          <w:numId w:val="4"/>
+        </w:numPr>
+        <w:ind w:firstLineChars="0"/>
+        <w:rPr>
+          <w:rFonts w:ascii="Times New Roman" w:hAnsi="Times New Roman" w:cs="Times New Roman"/>
+          <w:sz w:val="24"/>
+          <w:szCs w:val="24"/>
+        </w:rPr>
+      </w:pPr>
     </w:p>
     <w:p>
       <w:pPr>
@@ -5503,213 +5675,37 @@
         </w:numPr>
         <w:ind w:firstLineChars="0"/>
         <w:rPr>
-          <w:rFonts w:ascii="Times New Roman" w:hAnsi="Times New Roman" w:cs="Times New Roman"/>
-          <w:sz w:val="24"/>
-          <w:szCs w:val="24"/>
-        </w:rPr>
-      </w:pPr>
-      <w:r>
-        <w:rPr>
-          <w:rFonts w:ascii="Times New Roman" w:hAnsi="Times New Roman" w:cs="Times New Roman"/>
-          <w:sz w:val="24"/>
-          <w:szCs w:val="24"/>
-        </w:rPr>
-        <w:t>Never use</w:t>
-      </w:r>
-      <w:r>
-        <w:rPr>
-          <w:rFonts w:ascii="Times New Roman" w:hAnsi="Times New Roman" w:cs="Times New Roman"/>
-          <w:sz w:val="24"/>
-          <w:szCs w:val="24"/>
-        </w:rPr>
-        <w:t xml:space="preserve"> basic </w:t>
-      </w:r>
-      <w:r>
-        <w:rPr>
-          <w:rFonts w:ascii="Times New Roman" w:hAnsi="Times New Roman" w:cs="Times New Roman"/>
-          <w:sz w:val="24"/>
-          <w:szCs w:val="24"/>
-        </w:rPr>
-        <w:t xml:space="preserve">terms </w:t>
-      </w:r>
-      <w:r>
-        <w:rPr>
-          <w:rFonts w:ascii="Times New Roman" w:hAnsi="Times New Roman" w:cs="Times New Roman"/>
-          <w:sz w:val="24"/>
-          <w:szCs w:val="24"/>
-        </w:rPr>
-        <w:t>such as</w:t>
-      </w:r>
-      <w:r>
-        <w:rPr>
-          <w:rFonts w:ascii="Times New Roman" w:hAnsi="Times New Roman" w:cs="Times New Roman"/>
-          <w:sz w:val="24"/>
-          <w:szCs w:val="24"/>
-        </w:rPr>
-        <w:t xml:space="preserve"> “nice”</w:t>
-      </w:r>
-      <w:r>
-        <w:rPr>
-          <w:rFonts w:ascii="Times New Roman" w:hAnsi="Times New Roman" w:cs="Times New Roman"/>
-          <w:sz w:val="24"/>
-          <w:szCs w:val="24"/>
-        </w:rPr>
-        <w:t>, “be”</w:t>
-      </w:r>
-      <w:r>
-        <w:rPr>
-          <w:rFonts w:ascii="Times New Roman" w:hAnsi="Times New Roman" w:cs="Times New Roman"/>
-          <w:sz w:val="24"/>
-          <w:szCs w:val="24"/>
-        </w:rPr>
-        <w:t xml:space="preserve"> when you are in a speaking test. For example, </w:t>
-      </w:r>
-      <w:r>
-        <w:rPr>
-          <w:rFonts w:ascii="Times New Roman" w:hAnsi="Times New Roman" w:cs="Times New Roman"/>
-          <w:sz w:val="24"/>
-          <w:szCs w:val="24"/>
-        </w:rPr>
-        <w:br/>
-      </w:r>
-      <w:r>
-        <w:rPr>
-          <w:rFonts w:ascii="Times New Roman" w:hAnsi="Times New Roman" w:cs="Times New Roman" w:hint="eastAsia"/>
-          <w:sz w:val="24"/>
-          <w:szCs w:val="24"/>
-        </w:rPr>
-        <w:t>*</w:t>
-      </w:r>
-      <w:r>
-        <w:rPr>
-          <w:rFonts w:ascii="Times New Roman" w:hAnsi="Times New Roman" w:cs="Times New Roman"/>
-          <w:sz w:val="24"/>
-          <w:szCs w:val="24"/>
-        </w:rPr>
-        <w:t xml:space="preserve"> </w:t>
-      </w:r>
-      <w:r>
-        <w:rPr>
-          <w:rFonts w:ascii="Times New Roman" w:hAnsi="Times New Roman" w:cs="Times New Roman"/>
-          <w:sz w:val="24"/>
-          <w:szCs w:val="24"/>
-        </w:rPr>
-        <w:t>“</w:t>
-      </w:r>
-      <w:r>
-        <w:rPr>
-          <w:rFonts w:ascii="Times New Roman" w:hAnsi="Times New Roman" w:cs="Times New Roman"/>
-          <w:sz w:val="24"/>
-          <w:szCs w:val="24"/>
-        </w:rPr>
-        <w:t>I</w:t>
-      </w:r>
-      <w:r>
-        <w:rPr>
-          <w:rFonts w:ascii="Times New Roman" w:hAnsi="Times New Roman" w:cs="Times New Roman"/>
-          <w:sz w:val="24"/>
-          <w:szCs w:val="24"/>
-        </w:rPr>
-        <w:t xml:space="preserve">t’s a nice building” could be replaced by </w:t>
-      </w:r>
-      <w:r>
-        <w:rPr>
-          <w:rFonts w:ascii="Times New Roman" w:hAnsi="Times New Roman" w:cs="Times New Roman"/>
-          <w:sz w:val="24"/>
-          <w:szCs w:val="24"/>
-        </w:rPr>
-        <w:br/>
-      </w:r>
-      <w:r>
-        <w:rPr>
-          <w:rFonts w:ascii="Times New Roman" w:hAnsi="Times New Roman" w:cs="Times New Roman"/>
-          <w:sz w:val="24"/>
-          <w:szCs w:val="24"/>
-        </w:rPr>
-        <w:t xml:space="preserve">“The building has beautiful artichitecture”, </w:t>
-      </w:r>
-      <w:r>
-        <w:rPr>
-          <w:rFonts w:ascii="Times New Roman" w:hAnsi="Times New Roman" w:cs="Times New Roman"/>
-          <w:sz w:val="24"/>
-          <w:szCs w:val="24"/>
-        </w:rPr>
-        <w:br/>
-      </w:r>
-      <w:r>
-        <w:rPr>
-          <w:rFonts w:ascii="Times New Roman" w:hAnsi="Times New Roman" w:cs="Times New Roman" w:hint="eastAsia"/>
-          <w:sz w:val="24"/>
-          <w:szCs w:val="24"/>
-        </w:rPr>
-        <w:t>*</w:t>
-      </w:r>
-      <w:r>
-        <w:rPr>
-          <w:rFonts w:ascii="Times New Roman" w:hAnsi="Times New Roman" w:cs="Times New Roman"/>
-          <w:sz w:val="24"/>
-          <w:szCs w:val="24"/>
-        </w:rPr>
-        <w:t xml:space="preserve"> </w:t>
-      </w:r>
-      <w:r>
-        <w:rPr>
-          <w:rFonts w:ascii="Times New Roman" w:hAnsi="Times New Roman" w:cs="Times New Roman"/>
-          <w:sz w:val="24"/>
-          <w:szCs w:val="24"/>
-        </w:rPr>
-        <w:t xml:space="preserve">“We have nice friends” </w:t>
-      </w:r>
-      <w:r>
-        <w:rPr>
-          <w:rFonts w:ascii="Times New Roman" w:hAnsi="Times New Roman" w:cs="Times New Roman"/>
-          <w:sz w:val="24"/>
-          <w:szCs w:val="24"/>
-        </w:rPr>
-        <w:t xml:space="preserve">should be replaced by </w:t>
-      </w:r>
-      <w:r>
-        <w:rPr>
-          <w:rFonts w:ascii="Times New Roman" w:hAnsi="Times New Roman" w:cs="Times New Roman"/>
-          <w:sz w:val="24"/>
-          <w:szCs w:val="24"/>
-        </w:rPr>
-        <w:br/>
-        <w:t>“We have friends who are always there for us.”</w:t>
-      </w:r>
-      <w:r>
-        <w:rPr>
-          <w:rFonts w:ascii="Times New Roman" w:hAnsi="Times New Roman" w:cs="Times New Roman"/>
-          <w:sz w:val="24"/>
-          <w:szCs w:val="24"/>
-        </w:rPr>
-        <w:br/>
-        <w:t>“I love mathematics because it is a nice school subject” is replaced by</w:t>
-      </w:r>
-      <w:r>
-        <w:rPr>
-          <w:rFonts w:ascii="Times New Roman" w:hAnsi="Times New Roman" w:cs="Times New Roman"/>
-          <w:sz w:val="24"/>
-          <w:szCs w:val="24"/>
-        </w:rPr>
-        <w:br/>
-        <w:t>“My most favourite school subject is geography</w:t>
-      </w:r>
-      <w:r>
-        <w:rPr>
-          <w:rFonts w:ascii="Times New Roman" w:hAnsi="Times New Roman" w:cs="Times New Roman"/>
-          <w:sz w:val="24"/>
-          <w:szCs w:val="24"/>
-        </w:rPr>
-        <w:t>.</w:t>
-      </w:r>
-      <w:r>
-        <w:rPr>
-          <w:rFonts w:ascii="Times New Roman" w:hAnsi="Times New Roman" w:cs="Times New Roman"/>
-          <w:sz w:val="24"/>
-          <w:szCs w:val="24"/>
-        </w:rPr>
-        <w:t xml:space="preserve">” </w:t>
+          <w:rFonts w:ascii="Times New Roman" w:hAnsi="Times New Roman" w:cs="Times New Roman" w:hint="eastAsia"/>
+          <w:sz w:val="24"/>
+          <w:szCs w:val="24"/>
+        </w:rPr>
+      </w:pPr>
+      <w:r>
+        <w:rPr>
+          <w:rFonts w:ascii="Times New Roman" w:hAnsi="Times New Roman" w:cs="Times New Roman" w:hint="eastAsia"/>
+          <w:sz w:val="24"/>
+          <w:szCs w:val="24"/>
+        </w:rPr>
+        <w:t>Note of Band 7</w:t>
+      </w:r>
+    </w:p>
+    <w:p>
+      <w:pPr>
+        <w:pStyle w:val="a3"/>
+        <w:ind w:left="720" w:firstLineChars="0" w:firstLine="0"/>
+        <w:rPr>
+          <w:rFonts w:ascii="Times New Roman" w:hAnsi="Times New Roman" w:cs="Times New Roman" w:hint="eastAsia"/>
+          <w:sz w:val="24"/>
+          <w:szCs w:val="24"/>
+        </w:rPr>
+      </w:pPr>
+      <w:r>
+        <w:rPr>
+          <w:rFonts w:ascii="Times New Roman" w:hAnsi="Times New Roman" w:cs="Times New Roman" w:hint="eastAsia"/>
+          <w:sz w:val="24"/>
+          <w:szCs w:val="24"/>
+        </w:rPr>
+        <w:t>Notes of Koolearn Course offered by a foreign teacher.</w:t>
       </w:r>
     </w:p>
     <w:p>
@@ -5717,22 +5713,125 @@
         <w:pStyle w:val="a3"/>
         <w:numPr>
           <w:ilvl w:val="0"/>
-          <w:numId w:val="20"/>
+          <w:numId w:val="43"/>
         </w:numPr>
         <w:ind w:firstLineChars="0"/>
         <w:rPr>
-          <w:rFonts w:ascii="Times New Roman" w:hAnsi="Times New Roman" w:cs="Times New Roman"/>
-          <w:sz w:val="24"/>
-          <w:szCs w:val="24"/>
-        </w:rPr>
-      </w:pPr>
-      <w:r>
-        <w:rPr>
-          <w:rFonts w:ascii="Times New Roman" w:hAnsi="Times New Roman" w:cs="Times New Roman"/>
-          <w:sz w:val="24"/>
-          <w:szCs w:val="24"/>
-        </w:rPr>
-        <w:t>“I was in an interview yesterday.”</w:t>
+          <w:rFonts w:ascii="Times New Roman" w:hAnsi="Times New Roman" w:cs="Times New Roman" w:hint="eastAsia"/>
+          <w:sz w:val="24"/>
+          <w:szCs w:val="24"/>
+        </w:rPr>
+      </w:pPr>
+      <w:r>
+        <w:rPr>
+          <w:rFonts w:ascii="Times New Roman" w:hAnsi="Times New Roman" w:cs="Times New Roman" w:hint="eastAsia"/>
+          <w:sz w:val="24"/>
+          <w:szCs w:val="24"/>
+        </w:rPr>
+        <w:t xml:space="preserve">You have to learn lexical chunks(groups of words) and use them flexibly. </w:t>
+      </w:r>
+      <w:r>
+        <w:rPr>
+          <w:rFonts w:ascii="Times New Roman" w:hAnsi="Times New Roman" w:cs="Times New Roman" w:hint="eastAsia"/>
+          <w:sz w:val="24"/>
+          <w:szCs w:val="24"/>
+        </w:rPr>
+        <w:t>Human b</w:t>
+      </w:r>
+      <w:r>
+        <w:rPr>
+          <w:rFonts w:ascii="Times New Roman" w:hAnsi="Times New Roman" w:cs="Times New Roman" w:hint="eastAsia"/>
+          <w:sz w:val="24"/>
+          <w:szCs w:val="24"/>
+        </w:rPr>
+        <w:t xml:space="preserve">eings speak in groups of words. </w:t>
+      </w:r>
+    </w:p>
+    <w:p>
+      <w:pPr>
+        <w:pStyle w:val="a3"/>
+        <w:numPr>
+          <w:ilvl w:val="0"/>
+          <w:numId w:val="43"/>
+        </w:numPr>
+        <w:ind w:firstLineChars="0"/>
+        <w:rPr>
+          <w:rFonts w:ascii="Times New Roman" w:hAnsi="Times New Roman" w:cs="Times New Roman" w:hint="eastAsia"/>
+          <w:sz w:val="24"/>
+          <w:szCs w:val="24"/>
+        </w:rPr>
+      </w:pPr>
+      <w:r>
+        <w:rPr>
+          <w:rFonts w:ascii="Times New Roman" w:hAnsi="Times New Roman" w:cs="Times New Roman" w:hint="eastAsia"/>
+          <w:sz w:val="24"/>
+          <w:szCs w:val="24"/>
+        </w:rPr>
+        <w:lastRenderedPageBreak/>
+        <w:t>Use the language correctly. You don</w:t>
+      </w:r>
+      <w:r>
+        <w:rPr>
+          <w:rFonts w:ascii="Times New Roman" w:hAnsi="Times New Roman" w:cs="Times New Roman"/>
+          <w:sz w:val="24"/>
+          <w:szCs w:val="24"/>
+        </w:rPr>
+        <w:t>’</w:t>
+      </w:r>
+      <w:r>
+        <w:rPr>
+          <w:rFonts w:ascii="Times New Roman" w:hAnsi="Times New Roman" w:cs="Times New Roman" w:hint="eastAsia"/>
+          <w:sz w:val="24"/>
+          <w:szCs w:val="24"/>
+        </w:rPr>
+        <w:t xml:space="preserve">t need to speak compliated language to get a high band score. Instead, getting a high score is about using the correct language flexibly. </w:t>
+      </w:r>
+    </w:p>
+    <w:p>
+      <w:pPr>
+        <w:pStyle w:val="a3"/>
+        <w:numPr>
+          <w:ilvl w:val="0"/>
+          <w:numId w:val="43"/>
+        </w:numPr>
+        <w:ind w:firstLineChars="0"/>
+        <w:rPr>
+          <w:rFonts w:ascii="Times New Roman" w:hAnsi="Times New Roman" w:cs="Times New Roman" w:hint="eastAsia"/>
+          <w:sz w:val="24"/>
+          <w:szCs w:val="24"/>
+        </w:rPr>
+      </w:pPr>
+      <w:r>
+        <w:rPr>
+          <w:rFonts w:ascii="Times New Roman" w:hAnsi="Times New Roman" w:cs="Times New Roman" w:hint="eastAsia"/>
+          <w:sz w:val="24"/>
+          <w:szCs w:val="24"/>
+        </w:rPr>
+        <w:t>Don</w:t>
+      </w:r>
+      <w:r>
+        <w:rPr>
+          <w:rFonts w:ascii="Times New Roman" w:hAnsi="Times New Roman" w:cs="Times New Roman"/>
+          <w:sz w:val="24"/>
+          <w:szCs w:val="24"/>
+        </w:rPr>
+        <w:t>’</w:t>
+      </w:r>
+      <w:r>
+        <w:rPr>
+          <w:rFonts w:ascii="Times New Roman" w:hAnsi="Times New Roman" w:cs="Times New Roman" w:hint="eastAsia"/>
+          <w:sz w:val="24"/>
+          <w:szCs w:val="24"/>
+        </w:rPr>
+        <w:t>t underestimate Part 1 which take</w:t>
+      </w:r>
+      <w:r>
+        <w:rPr>
+          <w:rFonts w:ascii="Times New Roman" w:hAnsi="Times New Roman" w:cs="Times New Roman" w:hint="eastAsia"/>
+          <w:sz w:val="24"/>
+          <w:szCs w:val="24"/>
+        </w:rPr>
+        <w:t xml:space="preserve"> 33 persent of the total score. Practice question types of this part. </w:t>
       </w:r>
       <w:r>
         <w:rPr>
@@ -5746,32 +5845,216 @@
     <w:p>
       <w:pPr>
         <w:pStyle w:val="a3"/>
-        <w:ind w:left="1080" w:firstLineChars="0" w:firstLine="0"/>
-        <w:rPr>
-          <w:rFonts w:ascii="Times New Roman" w:hAnsi="Times New Roman" w:cs="Times New Roman"/>
-          <w:sz w:val="24"/>
-          <w:szCs w:val="24"/>
-        </w:rPr>
-      </w:pPr>
-      <w:r>
-        <w:rPr>
-          <w:rFonts w:ascii="Times New Roman" w:hAnsi="Times New Roman" w:cs="Times New Roman"/>
-          <w:sz w:val="24"/>
-          <w:szCs w:val="24"/>
-        </w:rPr>
-        <w:t>“I participated an interview yesterday.”</w:t>
-      </w:r>
-    </w:p>
-    <w:p>
-      <w:pPr>
-        <w:pStyle w:val="a3"/>
-        <w:ind w:left="1080" w:firstLineChars="0" w:firstLine="0"/>
-        <w:rPr>
-          <w:rFonts w:ascii="Times New Roman" w:hAnsi="Times New Roman" w:cs="Times New Roman"/>
-          <w:sz w:val="24"/>
-          <w:szCs w:val="24"/>
-        </w:rPr>
-      </w:pPr>
+        <w:numPr>
+          <w:ilvl w:val="0"/>
+          <w:numId w:val="43"/>
+        </w:numPr>
+        <w:ind w:firstLineChars="0"/>
+        <w:rPr>
+          <w:rFonts w:ascii="Times New Roman" w:hAnsi="Times New Roman" w:cs="Times New Roman" w:hint="eastAsia"/>
+          <w:sz w:val="24"/>
+          <w:szCs w:val="24"/>
+        </w:rPr>
+      </w:pPr>
+      <w:r>
+        <w:rPr>
+          <w:rFonts w:ascii="Times New Roman" w:hAnsi="Times New Roman" w:cs="Times New Roman" w:hint="eastAsia"/>
+          <w:sz w:val="24"/>
+          <w:szCs w:val="24"/>
+        </w:rPr>
+        <w:t>Speak at a calm, controlled pace. Don</w:t>
+      </w:r>
+      <w:r>
+        <w:rPr>
+          <w:rFonts w:ascii="Times New Roman" w:hAnsi="Times New Roman" w:cs="Times New Roman"/>
+          <w:sz w:val="24"/>
+          <w:szCs w:val="24"/>
+        </w:rPr>
+        <w:t>’</w:t>
+      </w:r>
+      <w:r>
+        <w:rPr>
+          <w:rFonts w:ascii="Times New Roman" w:hAnsi="Times New Roman" w:cs="Times New Roman" w:hint="eastAsia"/>
+          <w:sz w:val="24"/>
+          <w:szCs w:val="24"/>
+        </w:rPr>
+        <w:t xml:space="preserve">t speak fast. </w:t>
+      </w:r>
+    </w:p>
+    <w:p>
+      <w:pPr>
+        <w:pStyle w:val="a3"/>
+        <w:numPr>
+          <w:ilvl w:val="0"/>
+          <w:numId w:val="43"/>
+        </w:numPr>
+        <w:ind w:firstLineChars="0"/>
+        <w:rPr>
+          <w:rFonts w:ascii="Times New Roman" w:hAnsi="Times New Roman" w:cs="Times New Roman" w:hint="eastAsia"/>
+          <w:sz w:val="24"/>
+          <w:szCs w:val="24"/>
+        </w:rPr>
+      </w:pPr>
+      <w:r>
+        <w:rPr>
+          <w:rFonts w:ascii="Times New Roman" w:hAnsi="Times New Roman" w:cs="Times New Roman" w:hint="eastAsia"/>
+          <w:sz w:val="24"/>
+          <w:szCs w:val="24"/>
+        </w:rPr>
+        <w:t>Don</w:t>
+      </w:r>
+      <w:r>
+        <w:rPr>
+          <w:rFonts w:ascii="Times New Roman" w:hAnsi="Times New Roman" w:cs="Times New Roman"/>
+          <w:sz w:val="24"/>
+          <w:szCs w:val="24"/>
+        </w:rPr>
+        <w:t>’</w:t>
+      </w:r>
+      <w:r>
+        <w:rPr>
+          <w:rFonts w:ascii="Times New Roman" w:hAnsi="Times New Roman" w:cs="Times New Roman" w:hint="eastAsia"/>
+          <w:sz w:val="24"/>
+          <w:szCs w:val="24"/>
+        </w:rPr>
+        <w:t xml:space="preserve">t worry about the time. The examiner will interupt you if your time is used up. </w:t>
+      </w:r>
+    </w:p>
+    <w:p>
+      <w:pPr>
+        <w:pStyle w:val="a3"/>
+        <w:numPr>
+          <w:ilvl w:val="0"/>
+          <w:numId w:val="43"/>
+        </w:numPr>
+        <w:ind w:firstLineChars="0"/>
+        <w:rPr>
+          <w:rFonts w:ascii="Times New Roman" w:hAnsi="Times New Roman" w:cs="Times New Roman" w:hint="eastAsia"/>
+          <w:sz w:val="24"/>
+          <w:szCs w:val="24"/>
+        </w:rPr>
+      </w:pPr>
+      <w:r>
+        <w:rPr>
+          <w:rFonts w:ascii="Times New Roman" w:hAnsi="Times New Roman" w:cs="Times New Roman" w:hint="eastAsia"/>
+          <w:sz w:val="24"/>
+          <w:szCs w:val="24"/>
+        </w:rPr>
+        <w:t>Don</w:t>
+      </w:r>
+      <w:r>
+        <w:rPr>
+          <w:rFonts w:ascii="Times New Roman" w:hAnsi="Times New Roman" w:cs="Times New Roman"/>
+          <w:sz w:val="24"/>
+          <w:szCs w:val="24"/>
+        </w:rPr>
+        <w:t>’</w:t>
+      </w:r>
+      <w:r>
+        <w:rPr>
+          <w:rFonts w:ascii="Times New Roman" w:hAnsi="Times New Roman" w:cs="Times New Roman" w:hint="eastAsia"/>
+          <w:sz w:val="24"/>
+          <w:szCs w:val="24"/>
+        </w:rPr>
+        <w:t>t worry if you don</w:t>
+      </w:r>
+      <w:r>
+        <w:rPr>
+          <w:rFonts w:ascii="Times New Roman" w:hAnsi="Times New Roman" w:cs="Times New Roman"/>
+          <w:sz w:val="24"/>
+          <w:szCs w:val="24"/>
+        </w:rPr>
+        <w:t>’</w:t>
+      </w:r>
+      <w:r>
+        <w:rPr>
+          <w:rFonts w:ascii="Times New Roman" w:hAnsi="Times New Roman" w:cs="Times New Roman" w:hint="eastAsia"/>
+          <w:sz w:val="24"/>
+          <w:szCs w:val="24"/>
+        </w:rPr>
+        <w:t>t have enough to finish your answers. It</w:t>
+      </w:r>
+      <w:r>
+        <w:rPr>
+          <w:rFonts w:ascii="Times New Roman" w:hAnsi="Times New Roman" w:cs="Times New Roman"/>
+          <w:sz w:val="24"/>
+          <w:szCs w:val="24"/>
+        </w:rPr>
+        <w:t>’</w:t>
+      </w:r>
+      <w:r>
+        <w:rPr>
+          <w:rFonts w:ascii="Times New Roman" w:hAnsi="Times New Roman" w:cs="Times New Roman" w:hint="eastAsia"/>
+          <w:sz w:val="24"/>
+          <w:szCs w:val="24"/>
+        </w:rPr>
+        <w:t>s fine and won</w:t>
+      </w:r>
+      <w:r>
+        <w:rPr>
+          <w:rFonts w:ascii="Times New Roman" w:hAnsi="Times New Roman" w:cs="Times New Roman"/>
+          <w:sz w:val="24"/>
+          <w:szCs w:val="24"/>
+        </w:rPr>
+        <w:t>’</w:t>
+      </w:r>
+      <w:r>
+        <w:rPr>
+          <w:rFonts w:ascii="Times New Roman" w:hAnsi="Times New Roman" w:cs="Times New Roman" w:hint="eastAsia"/>
+          <w:sz w:val="24"/>
+          <w:szCs w:val="24"/>
+        </w:rPr>
+        <w:t xml:space="preserve">t affect your </w:t>
+      </w:r>
+      <w:r>
+        <w:rPr>
+          <w:rFonts w:ascii="Times New Roman" w:hAnsi="Times New Roman" w:cs="Times New Roman" w:hint="eastAsia"/>
+          <w:sz w:val="24"/>
+          <w:szCs w:val="24"/>
+        </w:rPr>
+        <w:t xml:space="preserve">band </w:t>
+      </w:r>
+      <w:r>
+        <w:rPr>
+          <w:rFonts w:ascii="Times New Roman" w:hAnsi="Times New Roman" w:cs="Times New Roman" w:hint="eastAsia"/>
+          <w:sz w:val="24"/>
+          <w:szCs w:val="24"/>
+        </w:rPr>
+        <w:t xml:space="preserve">socre. </w:t>
+      </w:r>
+    </w:p>
+    <w:p>
+      <w:pPr>
+        <w:pStyle w:val="a3"/>
+        <w:numPr>
+          <w:ilvl w:val="0"/>
+          <w:numId w:val="43"/>
+        </w:numPr>
+        <w:ind w:firstLineChars="0"/>
+        <w:rPr>
+          <w:rFonts w:ascii="Times New Roman" w:hAnsi="Times New Roman" w:cs="Times New Roman"/>
+          <w:sz w:val="24"/>
+          <w:szCs w:val="24"/>
+        </w:rPr>
+      </w:pPr>
+      <w:r>
+        <w:rPr>
+          <w:rFonts w:ascii="Times New Roman" w:hAnsi="Times New Roman" w:cs="Times New Roman" w:hint="eastAsia"/>
+          <w:sz w:val="24"/>
+          <w:szCs w:val="24"/>
+        </w:rPr>
+        <w:t>Record y</w:t>
+      </w:r>
+      <w:r>
+        <w:rPr>
+          <w:rFonts w:ascii="Times New Roman" w:hAnsi="Times New Roman" w:cs="Times New Roman" w:hint="eastAsia"/>
+          <w:sz w:val="24"/>
+          <w:szCs w:val="24"/>
+        </w:rPr>
+        <w:t xml:space="preserve">ourself and listen to yourself so that you can correct yourself. </w:t>
+      </w:r>
+      <w:bookmarkStart w:id="0" w:name="_GoBack"/>
+      <w:bookmarkEnd w:id="0"/>
     </w:p>
     <w:p>
       <w:pPr>
@@ -5827,7 +6110,6 @@
           <w:sz w:val="24"/>
           <w:szCs w:val="24"/>
         </w:rPr>
-        <w:lastRenderedPageBreak/>
         <w:t>Read the questions first.</w:t>
       </w:r>
     </w:p>
@@ -5948,8 +6230,6 @@
         </w:rPr>
         <w:t xml:space="preserve"> Because NO.2 is between NO.1 and NO.3.</w:t>
       </w:r>
-      <w:bookmarkStart w:id="0" w:name="_GoBack"/>
-      <w:bookmarkEnd w:id="0"/>
       <w:r>
         <w:rPr>
           <w:rFonts w:ascii="Times New Roman" w:hAnsi="Times New Roman" w:cs="Times New Roman" w:hint="eastAsia"/>
@@ -5968,7 +6248,7 @@
         </w:numPr>
         <w:ind w:firstLineChars="0"/>
         <w:rPr>
-          <w:rFonts w:ascii="Times New Roman" w:hAnsi="Times New Roman" w:cs="Times New Roman" w:hint="eastAsia"/>
+          <w:rFonts w:ascii="Times New Roman" w:hAnsi="Times New Roman" w:cs="Times New Roman"/>
           <w:sz w:val="24"/>
           <w:szCs w:val="24"/>
         </w:rPr>
@@ -6082,7 +6362,7 @@
       <w:pPr>
         <w:ind w:left="1080"/>
         <w:rPr>
-          <w:rFonts w:ascii="Times New Roman" w:hAnsi="Times New Roman" w:cs="Times New Roman" w:hint="eastAsia"/>
+          <w:rFonts w:ascii="Times New Roman" w:hAnsi="Times New Roman" w:cs="Times New Roman"/>
           <w:i/>
           <w:sz w:val="24"/>
           <w:szCs w:val="24"/>
@@ -6111,7 +6391,7 @@
       <w:pPr>
         <w:ind w:left="1080"/>
         <w:rPr>
-          <w:rFonts w:ascii="Times New Roman" w:hAnsi="Times New Roman" w:cs="Times New Roman" w:hint="eastAsia"/>
+          <w:rFonts w:ascii="Times New Roman" w:hAnsi="Times New Roman" w:cs="Times New Roman"/>
           <w:i/>
           <w:sz w:val="24"/>
           <w:szCs w:val="24"/>
@@ -6131,7 +6411,7 @@
       <w:pPr>
         <w:ind w:left="1080"/>
         <w:rPr>
-          <w:rFonts w:ascii="Times New Roman" w:hAnsi="Times New Roman" w:cs="Times New Roman" w:hint="eastAsia"/>
+          <w:rFonts w:ascii="Times New Roman" w:hAnsi="Times New Roman" w:cs="Times New Roman"/>
           <w:sz w:val="24"/>
           <w:szCs w:val="24"/>
         </w:rPr>
@@ -6167,7 +6447,7 @@
       <w:pPr>
         <w:ind w:left="1080"/>
         <w:rPr>
-          <w:rFonts w:ascii="Times New Roman" w:hAnsi="Times New Roman" w:cs="Times New Roman" w:hint="eastAsia"/>
+          <w:rFonts w:ascii="Times New Roman" w:hAnsi="Times New Roman" w:cs="Times New Roman"/>
           <w:sz w:val="24"/>
           <w:szCs w:val="24"/>
         </w:rPr>
@@ -6185,7 +6465,7 @@
       <w:pPr>
         <w:ind w:left="1080"/>
         <w:rPr>
-          <w:rFonts w:ascii="Times New Roman" w:hAnsi="Times New Roman" w:cs="Times New Roman" w:hint="eastAsia"/>
+          <w:rFonts w:ascii="Times New Roman" w:hAnsi="Times New Roman" w:cs="Times New Roman"/>
           <w:sz w:val="24"/>
           <w:szCs w:val="24"/>
         </w:rPr>
@@ -6254,7 +6534,7 @@
       <w:pPr>
         <w:ind w:left="1080"/>
         <w:rPr>
-          <w:rFonts w:ascii="Times New Roman" w:hAnsi="Times New Roman" w:cs="Times New Roman" w:hint="eastAsia"/>
+          <w:rFonts w:ascii="Times New Roman" w:hAnsi="Times New Roman" w:cs="Times New Roman"/>
           <w:sz w:val="24"/>
           <w:szCs w:val="24"/>
         </w:rPr>
@@ -6281,7 +6561,7 @@
       <w:pPr>
         <w:ind w:left="1080"/>
         <w:rPr>
-          <w:rFonts w:ascii="Times New Roman" w:hAnsi="Times New Roman" w:cs="Times New Roman" w:hint="eastAsia"/>
+          <w:rFonts w:ascii="Times New Roman" w:hAnsi="Times New Roman" w:cs="Times New Roman"/>
           <w:sz w:val="24"/>
           <w:szCs w:val="24"/>
         </w:rPr>
@@ -6591,7 +6871,16 @@
           <w:sz w:val="24"/>
           <w:szCs w:val="24"/>
         </w:rPr>
-        <w:t>ones. a-&gt;b, b-&gt;c…</w:t>
+        <w:t xml:space="preserve">ones. </w:t>
+      </w:r>
+      <w:r>
+        <w:rPr>
+          <w:rFonts w:ascii="Times New Roman" w:hAnsi="Times New Roman" w:cs="Times New Roman"/>
+          <w:sz w:val="24"/>
+          <w:szCs w:val="24"/>
+        </w:rPr>
+        <w:lastRenderedPageBreak/>
+        <w:t>a-&gt;b, b-&gt;c…</w:t>
       </w:r>
       <w:r>
         <w:rPr>
@@ -6874,16 +7163,7 @@
           <w:sz w:val="24"/>
           <w:szCs w:val="24"/>
         </w:rPr>
-        <w:t xml:space="preserve">Review model answers and examiner’s comments on that, you will know </w:t>
-      </w:r>
-      <w:r>
-        <w:rPr>
-          <w:rFonts w:ascii="Times New Roman" w:hAnsi="Times New Roman" w:cs="Times New Roman"/>
-          <w:sz w:val="24"/>
-          <w:szCs w:val="24"/>
-        </w:rPr>
-        <w:lastRenderedPageBreak/>
-        <w:t>how to get a high score in writing tasks.</w:t>
+        <w:t>Review model answers and examiner’s comments on that, you will know how to get a high score in writing tasks.</w:t>
       </w:r>
     </w:p>
     <w:p>
@@ -8062,7 +8342,16 @@
           <w:sz w:val="24"/>
           <w:szCs w:val="24"/>
         </w:rPr>
-        <w:t xml:space="preserve"> is too direct and simple. Instead, we should write sentence like </w:t>
+        <w:t xml:space="preserve"> is </w:t>
+      </w:r>
+      <w:r>
+        <w:rPr>
+          <w:rFonts w:ascii="Times New Roman" w:hAnsi="Times New Roman" w:cs="Times New Roman" w:hint="eastAsia"/>
+          <w:sz w:val="24"/>
+          <w:szCs w:val="24"/>
+        </w:rPr>
+        <w:lastRenderedPageBreak/>
+        <w:t xml:space="preserve">too direct and simple. Instead, we should write sentence like </w:t>
       </w:r>
       <w:r>
         <w:rPr>
@@ -8251,7 +8540,6 @@
           <w:szCs w:val="32"/>
           <w:lang w:val="en-GB"/>
         </w:rPr>
-        <w:lastRenderedPageBreak/>
         <w:t xml:space="preserve">Writing </w:t>
       </w:r>
       <w:r>
@@ -8729,6 +9017,7 @@
           <w:szCs w:val="24"/>
           <w:lang w:val="en-GB"/>
         </w:rPr>
+        <w:lastRenderedPageBreak/>
         <w:drawing>
           <wp:inline distT="0" distB="0" distL="0" distR="0">
             <wp:extent cx="3333750" cy="2325156"/>
@@ -9427,7 +9716,17 @@
           <w:szCs w:val="24"/>
           <w:lang w:val="en-GB"/>
         </w:rPr>
-        <w:t>t look for something interesting. Your essay don</w:t>
+        <w:t xml:space="preserve">t look </w:t>
+      </w:r>
+      <w:r>
+        <w:rPr>
+          <w:rFonts w:ascii="Times New Roman" w:hAnsi="Times New Roman" w:cs="Times New Roman" w:hint="eastAsia"/>
+          <w:sz w:val="24"/>
+          <w:szCs w:val="24"/>
+          <w:lang w:val="en-GB"/>
+        </w:rPr>
+        <w:lastRenderedPageBreak/>
+        <w:t>for something interesting. Your essay don</w:t>
       </w:r>
       <w:r>
         <w:rPr>
@@ -9851,7 +10150,6 @@
           <w:sz w:val="24"/>
           <w:szCs w:val="24"/>
         </w:rPr>
-        <w:lastRenderedPageBreak/>
         <w:t xml:space="preserve">3. Aiming </w:t>
       </w:r>
       <w:r>
@@ -10381,6 +10679,7 @@
           <w:sz w:val="24"/>
           <w:szCs w:val="24"/>
         </w:rPr>
+        <w:lastRenderedPageBreak/>
         <w:t>The amount of meat consumed</w:t>
       </w:r>
       <w:r>
@@ -11322,7 +11621,6 @@
           <w:sz w:val="26"/>
           <w:szCs w:val="26"/>
         </w:rPr>
-        <w:lastRenderedPageBreak/>
         <w:t>Living in Cities</w:t>
       </w:r>
     </w:p>
@@ -11907,7 +12205,6 @@
           <w:noProof/>
           <w:lang w:val="en-GB"/>
         </w:rPr>
-        <w:lastRenderedPageBreak/>
         <w:drawing>
           <wp:inline distT="0" distB="0" distL="0" distR="0">
             <wp:extent cx="5274310" cy="1809115"/>
@@ -12781,6 +13078,95 @@
     </w:lvl>
   </w:abstractNum>
   <w:abstractNum w:abstractNumId="7">
+    <w:nsid w:val="14D42A7B"/>
+    <w:multiLevelType w:val="hybridMultilevel"/>
+    <w:tmpl w:val="53CC1B9A"/>
+    <w:lvl w:ilvl="0" w:tplc="664607EC">
+      <w:start w:val="1"/>
+      <w:numFmt w:val="decimal"/>
+      <w:lvlText w:val="%1."/>
+      <w:lvlJc w:val="left"/>
+      <w:pPr>
+        <w:ind w:left="1080" w:hanging="360"/>
+      </w:pPr>
+      <w:rPr>
+        <w:rFonts w:hint="default"/>
+      </w:rPr>
+    </w:lvl>
+    <w:lvl w:ilvl="1" w:tplc="08090019" w:tentative="1">
+      <w:start w:val="1"/>
+      <w:numFmt w:val="lowerLetter"/>
+      <w:lvlText w:val="%2."/>
+      <w:lvlJc w:val="left"/>
+      <w:pPr>
+        <w:ind w:left="1800" w:hanging="360"/>
+      </w:pPr>
+    </w:lvl>
+    <w:lvl w:ilvl="2" w:tplc="0809001B" w:tentative="1">
+      <w:start w:val="1"/>
+      <w:numFmt w:val="lowerRoman"/>
+      <w:lvlText w:val="%3."/>
+      <w:lvlJc w:val="right"/>
+      <w:pPr>
+        <w:ind w:left="2520" w:hanging="180"/>
+      </w:pPr>
+    </w:lvl>
+    <w:lvl w:ilvl="3" w:tplc="0809000F" w:tentative="1">
+      <w:start w:val="1"/>
+      <w:numFmt w:val="decimal"/>
+      <w:lvlText w:val="%4."/>
+      <w:lvlJc w:val="left"/>
+      <w:pPr>
+        <w:ind w:left="3240" w:hanging="360"/>
+      </w:pPr>
+    </w:lvl>
+    <w:lvl w:ilvl="4" w:tplc="08090019" w:tentative="1">
+      <w:start w:val="1"/>
+      <w:numFmt w:val="lowerLetter"/>
+      <w:lvlText w:val="%5."/>
+      <w:lvlJc w:val="left"/>
+      <w:pPr>
+        <w:ind w:left="3960" w:hanging="360"/>
+      </w:pPr>
+    </w:lvl>
+    <w:lvl w:ilvl="5" w:tplc="0809001B" w:tentative="1">
+      <w:start w:val="1"/>
+      <w:numFmt w:val="lowerRoman"/>
+      <w:lvlText w:val="%6."/>
+      <w:lvlJc w:val="right"/>
+      <w:pPr>
+        <w:ind w:left="4680" w:hanging="180"/>
+      </w:pPr>
+    </w:lvl>
+    <w:lvl w:ilvl="6" w:tplc="0809000F" w:tentative="1">
+      <w:start w:val="1"/>
+      <w:numFmt w:val="decimal"/>
+      <w:lvlText w:val="%7."/>
+      <w:lvlJc w:val="left"/>
+      <w:pPr>
+        <w:ind w:left="5400" w:hanging="360"/>
+      </w:pPr>
+    </w:lvl>
+    <w:lvl w:ilvl="7" w:tplc="08090019" w:tentative="1">
+      <w:start w:val="1"/>
+      <w:numFmt w:val="lowerLetter"/>
+      <w:lvlText w:val="%8."/>
+      <w:lvlJc w:val="left"/>
+      <w:pPr>
+        <w:ind w:left="6120" w:hanging="360"/>
+      </w:pPr>
+    </w:lvl>
+    <w:lvl w:ilvl="8" w:tplc="0809001B" w:tentative="1">
+      <w:start w:val="1"/>
+      <w:numFmt w:val="lowerRoman"/>
+      <w:lvlText w:val="%9."/>
+      <w:lvlJc w:val="right"/>
+      <w:pPr>
+        <w:ind w:left="6840" w:hanging="180"/>
+      </w:pPr>
+    </w:lvl>
+  </w:abstractNum>
+  <w:abstractNum w:abstractNumId="8">
     <w:nsid w:val="16A7494D"/>
     <w:multiLevelType w:val="hybridMultilevel"/>
     <w:tmpl w:val="B5AC2462"/>
@@ -12869,7 +13255,7 @@
       </w:pPr>
     </w:lvl>
   </w:abstractNum>
-  <w:abstractNum w:abstractNumId="8">
+  <w:abstractNum w:abstractNumId="9">
     <w:nsid w:val="18A80F16"/>
     <w:multiLevelType w:val="hybridMultilevel"/>
     <w:tmpl w:val="126AB91E"/>
@@ -12958,7 +13344,7 @@
       </w:pPr>
     </w:lvl>
   </w:abstractNum>
-  <w:abstractNum w:abstractNumId="9">
+  <w:abstractNum w:abstractNumId="10">
     <w:nsid w:val="1B9A1FE7"/>
     <w:multiLevelType w:val="hybridMultilevel"/>
     <w:tmpl w:val="55B452CA"/>
@@ -13044,7 +13430,7 @@
       </w:pPr>
     </w:lvl>
   </w:abstractNum>
-  <w:abstractNum w:abstractNumId="10">
+  <w:abstractNum w:abstractNumId="11">
     <w:nsid w:val="209238C5"/>
     <w:multiLevelType w:val="hybridMultilevel"/>
     <w:tmpl w:val="A0243708"/>
@@ -13157,7 +13543,7 @@
       </w:rPr>
     </w:lvl>
   </w:abstractNum>
-  <w:abstractNum w:abstractNumId="11">
+  <w:abstractNum w:abstractNumId="12">
     <w:nsid w:val="212124E8"/>
     <w:multiLevelType w:val="hybridMultilevel"/>
     <w:tmpl w:val="69A8EF30"/>
@@ -13247,7 +13633,7 @@
       </w:pPr>
     </w:lvl>
   </w:abstractNum>
-  <w:abstractNum w:abstractNumId="12">
+  <w:abstractNum w:abstractNumId="13">
     <w:nsid w:val="2BEB1066"/>
     <w:multiLevelType w:val="hybridMultilevel"/>
     <w:tmpl w:val="E6D86D48"/>
@@ -13336,7 +13722,7 @@
       </w:pPr>
     </w:lvl>
   </w:abstractNum>
-  <w:abstractNum w:abstractNumId="13">
+  <w:abstractNum w:abstractNumId="14">
     <w:nsid w:val="2C062616"/>
     <w:multiLevelType w:val="hybridMultilevel"/>
     <w:tmpl w:val="95989316"/>
@@ -13425,7 +13811,7 @@
       </w:pPr>
     </w:lvl>
   </w:abstractNum>
-  <w:abstractNum w:abstractNumId="14">
+  <w:abstractNum w:abstractNumId="15">
     <w:nsid w:val="31540ECA"/>
     <w:multiLevelType w:val="hybridMultilevel"/>
     <w:tmpl w:val="126AB91E"/>
@@ -13514,7 +13900,7 @@
       </w:pPr>
     </w:lvl>
   </w:abstractNum>
-  <w:abstractNum w:abstractNumId="15">
+  <w:abstractNum w:abstractNumId="16">
     <w:nsid w:val="39023B55"/>
     <w:multiLevelType w:val="hybridMultilevel"/>
     <w:tmpl w:val="088C4908"/>
@@ -13603,7 +13989,7 @@
       </w:pPr>
     </w:lvl>
   </w:abstractNum>
-  <w:abstractNum w:abstractNumId="16">
+  <w:abstractNum w:abstractNumId="17">
     <w:nsid w:val="39187DDC"/>
     <w:multiLevelType w:val="multilevel"/>
     <w:tmpl w:val="4BF67E82"/>
@@ -13752,7 +14138,7 @@
       </w:rPr>
     </w:lvl>
   </w:abstractNum>
-  <w:abstractNum w:abstractNumId="17">
+  <w:abstractNum w:abstractNumId="18">
     <w:nsid w:val="39EC4767"/>
     <w:multiLevelType w:val="multilevel"/>
     <w:tmpl w:val="1958AEFE"/>
@@ -13865,7 +14251,7 @@
       </w:pPr>
     </w:lvl>
   </w:abstractNum>
-  <w:abstractNum w:abstractNumId="18">
+  <w:abstractNum w:abstractNumId="19">
     <w:nsid w:val="3B3220EC"/>
     <w:multiLevelType w:val="hybridMultilevel"/>
     <w:tmpl w:val="B68E0AD8"/>
@@ -13954,7 +14340,7 @@
       </w:pPr>
     </w:lvl>
   </w:abstractNum>
-  <w:abstractNum w:abstractNumId="19">
+  <w:abstractNum w:abstractNumId="20">
     <w:nsid w:val="41023E2D"/>
     <w:multiLevelType w:val="hybridMultilevel"/>
     <w:tmpl w:val="6192BA58"/>
@@ -14066,7 +14452,7 @@
       </w:rPr>
     </w:lvl>
   </w:abstractNum>
-  <w:abstractNum w:abstractNumId="20">
+  <w:abstractNum w:abstractNumId="21">
     <w:nsid w:val="410D4E95"/>
     <w:multiLevelType w:val="hybridMultilevel"/>
     <w:tmpl w:val="7BB0B226"/>
@@ -14155,7 +14541,7 @@
       </w:pPr>
     </w:lvl>
   </w:abstractNum>
-  <w:abstractNum w:abstractNumId="21">
+  <w:abstractNum w:abstractNumId="22">
     <w:nsid w:val="41C612F8"/>
     <w:multiLevelType w:val="hybridMultilevel"/>
     <w:tmpl w:val="FA423BE8"/>
@@ -14244,7 +14630,7 @@
       </w:pPr>
     </w:lvl>
   </w:abstractNum>
-  <w:abstractNum w:abstractNumId="22">
+  <w:abstractNum w:abstractNumId="23">
     <w:nsid w:val="431D7B70"/>
     <w:multiLevelType w:val="hybridMultilevel"/>
     <w:tmpl w:val="B88C75C0"/>
@@ -14333,7 +14719,7 @@
       </w:pPr>
     </w:lvl>
   </w:abstractNum>
-  <w:abstractNum w:abstractNumId="23">
+  <w:abstractNum w:abstractNumId="24">
     <w:nsid w:val="45AC0CEE"/>
     <w:multiLevelType w:val="hybridMultilevel"/>
     <w:tmpl w:val="A6FA4E9E"/>
@@ -14422,7 +14808,7 @@
       </w:pPr>
     </w:lvl>
   </w:abstractNum>
-  <w:abstractNum w:abstractNumId="24">
+  <w:abstractNum w:abstractNumId="25">
     <w:nsid w:val="49614F41"/>
     <w:multiLevelType w:val="hybridMultilevel"/>
     <w:tmpl w:val="21F4F90A"/>
@@ -14511,7 +14897,7 @@
       </w:pPr>
     </w:lvl>
   </w:abstractNum>
-  <w:abstractNum w:abstractNumId="25">
+  <w:abstractNum w:abstractNumId="26">
     <w:nsid w:val="4CDD0872"/>
     <w:multiLevelType w:val="hybridMultilevel"/>
     <w:tmpl w:val="77F44C94"/>
@@ -14600,7 +14986,7 @@
       </w:pPr>
     </w:lvl>
   </w:abstractNum>
-  <w:abstractNum w:abstractNumId="26">
+  <w:abstractNum w:abstractNumId="27">
     <w:nsid w:val="4E11184C"/>
     <w:multiLevelType w:val="hybridMultilevel"/>
     <w:tmpl w:val="228EF806"/>
@@ -14689,7 +15075,7 @@
       </w:pPr>
     </w:lvl>
   </w:abstractNum>
-  <w:abstractNum w:abstractNumId="27">
+  <w:abstractNum w:abstractNumId="28">
     <w:nsid w:val="501466CA"/>
     <w:multiLevelType w:val="hybridMultilevel"/>
     <w:tmpl w:val="DB060F1C"/>
@@ -14778,7 +15164,7 @@
       </w:pPr>
     </w:lvl>
   </w:abstractNum>
-  <w:abstractNum w:abstractNumId="28">
+  <w:abstractNum w:abstractNumId="29">
     <w:nsid w:val="520832F2"/>
     <w:multiLevelType w:val="hybridMultilevel"/>
     <w:tmpl w:val="BCEC49F6"/>
@@ -14867,7 +15253,7 @@
       </w:pPr>
     </w:lvl>
   </w:abstractNum>
-  <w:abstractNum w:abstractNumId="29">
+  <w:abstractNum w:abstractNumId="30">
     <w:nsid w:val="52E96F60"/>
     <w:multiLevelType w:val="hybridMultilevel"/>
     <w:tmpl w:val="4C9EDF58"/>
@@ -14956,7 +15342,7 @@
       </w:pPr>
     </w:lvl>
   </w:abstractNum>
-  <w:abstractNum w:abstractNumId="30">
+  <w:abstractNum w:abstractNumId="31">
     <w:nsid w:val="564B4D6F"/>
     <w:multiLevelType w:val="hybridMultilevel"/>
     <w:tmpl w:val="463245A8"/>
@@ -15045,7 +15431,7 @@
       </w:pPr>
     </w:lvl>
   </w:abstractNum>
-  <w:abstractNum w:abstractNumId="31">
+  <w:abstractNum w:abstractNumId="32">
     <w:nsid w:val="58B561CD"/>
     <w:multiLevelType w:val="hybridMultilevel"/>
     <w:tmpl w:val="29B0D430"/>
@@ -15134,7 +15520,7 @@
       </w:pPr>
     </w:lvl>
   </w:abstractNum>
-  <w:abstractNum w:abstractNumId="32">
+  <w:abstractNum w:abstractNumId="33">
     <w:nsid w:val="5B161B8B"/>
     <w:multiLevelType w:val="hybridMultilevel"/>
     <w:tmpl w:val="EC52B5E6"/>
@@ -15223,7 +15609,7 @@
       </w:pPr>
     </w:lvl>
   </w:abstractNum>
-  <w:abstractNum w:abstractNumId="33">
+  <w:abstractNum w:abstractNumId="34">
     <w:nsid w:val="6AB57236"/>
     <w:multiLevelType w:val="hybridMultilevel"/>
     <w:tmpl w:val="93409AFE"/>
@@ -15312,7 +15698,7 @@
       </w:pPr>
     </w:lvl>
   </w:abstractNum>
-  <w:abstractNum w:abstractNumId="34">
+  <w:abstractNum w:abstractNumId="35">
     <w:nsid w:val="6B015DF7"/>
     <w:multiLevelType w:val="hybridMultilevel"/>
     <w:tmpl w:val="7944BF90"/>
@@ -15425,7 +15811,7 @@
       </w:rPr>
     </w:lvl>
   </w:abstractNum>
-  <w:abstractNum w:abstractNumId="35">
+  <w:abstractNum w:abstractNumId="36">
     <w:nsid w:val="6B1541E7"/>
     <w:multiLevelType w:val="multilevel"/>
     <w:tmpl w:val="0956637E"/>
@@ -15538,7 +15924,7 @@
       </w:rPr>
     </w:lvl>
   </w:abstractNum>
-  <w:abstractNum w:abstractNumId="36">
+  <w:abstractNum w:abstractNumId="37">
     <w:nsid w:val="6D424F83"/>
     <w:multiLevelType w:val="hybridMultilevel"/>
     <w:tmpl w:val="538C7D02"/>
@@ -15627,7 +16013,7 @@
       </w:pPr>
     </w:lvl>
   </w:abstractNum>
-  <w:abstractNum w:abstractNumId="37">
+  <w:abstractNum w:abstractNumId="38">
     <w:nsid w:val="72492BB2"/>
     <w:multiLevelType w:val="hybridMultilevel"/>
     <w:tmpl w:val="0876E89C"/>
@@ -15716,7 +16102,7 @@
       </w:pPr>
     </w:lvl>
   </w:abstractNum>
-  <w:abstractNum w:abstractNumId="38">
+  <w:abstractNum w:abstractNumId="39">
     <w:nsid w:val="72D95071"/>
     <w:multiLevelType w:val="multilevel"/>
     <w:tmpl w:val="93E65C2C"/>
@@ -15829,7 +16215,7 @@
       </w:pPr>
     </w:lvl>
   </w:abstractNum>
-  <w:abstractNum w:abstractNumId="39">
+  <w:abstractNum w:abstractNumId="40">
     <w:nsid w:val="742C11E5"/>
     <w:multiLevelType w:val="hybridMultilevel"/>
     <w:tmpl w:val="6F6AD0D8"/>
@@ -15915,7 +16301,7 @@
       </w:pPr>
     </w:lvl>
   </w:abstractNum>
-  <w:abstractNum w:abstractNumId="40">
+  <w:abstractNum w:abstractNumId="41">
     <w:nsid w:val="759F2CA0"/>
     <w:multiLevelType w:val="hybridMultilevel"/>
     <w:tmpl w:val="E3D4CFB6"/>
@@ -16004,7 +16390,7 @@
       </w:pPr>
     </w:lvl>
   </w:abstractNum>
-  <w:abstractNum w:abstractNumId="41">
+  <w:abstractNum w:abstractNumId="42">
     <w:nsid w:val="79341CC1"/>
     <w:multiLevelType w:val="hybridMultilevel"/>
     <w:tmpl w:val="670CA2F0"/>
@@ -16094,13 +16480,13 @@
     </w:lvl>
   </w:abstractNum>
   <w:num w:numId="1">
-    <w:abstractNumId w:val="25"/>
+    <w:abstractNumId w:val="26"/>
   </w:num>
   <w:num w:numId="2">
-    <w:abstractNumId w:val="21"/>
+    <w:abstractNumId w:val="22"/>
   </w:num>
   <w:num w:numId="3">
-    <w:abstractNumId w:val="18"/>
+    <w:abstractNumId w:val="19"/>
   </w:num>
   <w:num w:numId="4">
     <w:abstractNumId w:val="4"/>
@@ -16109,85 +16495,85 @@
     <w:abstractNumId w:val="2"/>
   </w:num>
   <w:num w:numId="6">
-    <w:abstractNumId w:val="22"/>
+    <w:abstractNumId w:val="23"/>
   </w:num>
   <w:num w:numId="7">
     <w:abstractNumId w:val="5"/>
   </w:num>
   <w:num w:numId="8">
+    <w:abstractNumId w:val="28"/>
+  </w:num>
+  <w:num w:numId="9">
+    <w:abstractNumId w:val="32"/>
+  </w:num>
+  <w:num w:numId="10">
+    <w:abstractNumId w:val="17"/>
+  </w:num>
+  <w:num w:numId="11">
+    <w:abstractNumId w:val="12"/>
+  </w:num>
+  <w:num w:numId="12">
+    <w:abstractNumId w:val="34"/>
+  </w:num>
+  <w:num w:numId="13">
+    <w:abstractNumId w:val="38"/>
+  </w:num>
+  <w:num w:numId="14">
+    <w:abstractNumId w:val="35"/>
+  </w:num>
+  <w:num w:numId="15">
+    <w:abstractNumId w:val="11"/>
+  </w:num>
+  <w:num w:numId="16">
+    <w:abstractNumId w:val="36"/>
+  </w:num>
+  <w:num w:numId="17">
+    <w:abstractNumId w:val="40"/>
+  </w:num>
+  <w:num w:numId="18">
+    <w:abstractNumId w:val="13"/>
+  </w:num>
+  <w:num w:numId="19">
+    <w:abstractNumId w:val="31"/>
+  </w:num>
+  <w:num w:numId="20">
+    <w:abstractNumId w:val="20"/>
+  </w:num>
+  <w:num w:numId="21">
+    <w:abstractNumId w:val="33"/>
+  </w:num>
+  <w:num w:numId="22">
+    <w:abstractNumId w:val="21"/>
+  </w:num>
+  <w:num w:numId="23">
+    <w:abstractNumId w:val="25"/>
+  </w:num>
+  <w:num w:numId="24">
+    <w:abstractNumId w:val="14"/>
+  </w:num>
+  <w:num w:numId="25">
+    <w:abstractNumId w:val="42"/>
+  </w:num>
+  <w:num w:numId="26">
+    <w:abstractNumId w:val="30"/>
+  </w:num>
+  <w:num w:numId="27">
+    <w:abstractNumId w:val="16"/>
+  </w:num>
+  <w:num w:numId="28">
+    <w:abstractNumId w:val="29"/>
+  </w:num>
+  <w:num w:numId="29">
+    <w:abstractNumId w:val="8"/>
+  </w:num>
+  <w:num w:numId="30">
     <w:abstractNumId w:val="27"/>
   </w:num>
-  <w:num w:numId="9">
-    <w:abstractNumId w:val="31"/>
-  </w:num>
-  <w:num w:numId="10">
-    <w:abstractNumId w:val="16"/>
-  </w:num>
-  <w:num w:numId="11">
-    <w:abstractNumId w:val="11"/>
-  </w:num>
-  <w:num w:numId="12">
-    <w:abstractNumId w:val="33"/>
-  </w:num>
-  <w:num w:numId="13">
-    <w:abstractNumId w:val="37"/>
-  </w:num>
-  <w:num w:numId="14">
-    <w:abstractNumId w:val="34"/>
-  </w:num>
-  <w:num w:numId="15">
-    <w:abstractNumId w:val="10"/>
-  </w:num>
-  <w:num w:numId="16">
-    <w:abstractNumId w:val="35"/>
-  </w:num>
-  <w:num w:numId="17">
-    <w:abstractNumId w:val="39"/>
-  </w:num>
-  <w:num w:numId="18">
-    <w:abstractNumId w:val="12"/>
-  </w:num>
-  <w:num w:numId="19">
-    <w:abstractNumId w:val="30"/>
-  </w:num>
-  <w:num w:numId="20">
-    <w:abstractNumId w:val="19"/>
-  </w:num>
-  <w:num w:numId="21">
-    <w:abstractNumId w:val="32"/>
-  </w:num>
-  <w:num w:numId="22">
-    <w:abstractNumId w:val="20"/>
-  </w:num>
-  <w:num w:numId="23">
-    <w:abstractNumId w:val="24"/>
-  </w:num>
-  <w:num w:numId="24">
-    <w:abstractNumId w:val="13"/>
-  </w:num>
-  <w:num w:numId="25">
+  <w:num w:numId="31">
     <w:abstractNumId w:val="41"/>
   </w:num>
-  <w:num w:numId="26">
-    <w:abstractNumId w:val="29"/>
-  </w:num>
-  <w:num w:numId="27">
-    <w:abstractNumId w:val="15"/>
-  </w:num>
-  <w:num w:numId="28">
-    <w:abstractNumId w:val="28"/>
-  </w:num>
-  <w:num w:numId="29">
-    <w:abstractNumId w:val="7"/>
-  </w:num>
-  <w:num w:numId="30">
-    <w:abstractNumId w:val="26"/>
-  </w:num>
-  <w:num w:numId="31">
-    <w:abstractNumId w:val="40"/>
-  </w:num>
   <w:num w:numId="32">
-    <w:abstractNumId w:val="23"/>
+    <w:abstractNumId w:val="24"/>
   </w:num>
   <w:num w:numId="33">
     <w:abstractNumId w:val="1"/>
@@ -16196,28 +16582,31 @@
     <w:abstractNumId w:val="0"/>
   </w:num>
   <w:num w:numId="35">
-    <w:abstractNumId w:val="38"/>
+    <w:abstractNumId w:val="39"/>
   </w:num>
   <w:num w:numId="36">
-    <w:abstractNumId w:val="17"/>
+    <w:abstractNumId w:val="18"/>
   </w:num>
   <w:num w:numId="37">
-    <w:abstractNumId w:val="14"/>
+    <w:abstractNumId w:val="15"/>
   </w:num>
   <w:num w:numId="38">
-    <w:abstractNumId w:val="9"/>
+    <w:abstractNumId w:val="10"/>
   </w:num>
   <w:num w:numId="39">
-    <w:abstractNumId w:val="36"/>
+    <w:abstractNumId w:val="37"/>
   </w:num>
   <w:num w:numId="40">
-    <w:abstractNumId w:val="8"/>
+    <w:abstractNumId w:val="9"/>
   </w:num>
   <w:num w:numId="41">
     <w:abstractNumId w:val="3"/>
   </w:num>
   <w:num w:numId="42">
     <w:abstractNumId w:val="6"/>
+  </w:num>
+  <w:num w:numId="43">
+    <w:abstractNumId w:val="7"/>
   </w:num>
 </w:numbering>
 </file>
@@ -17089,7 +17478,7 @@
   <a:extraClrSchemeLst/>
   <a:extLst>
     <a:ext uri="{05A4C25C-085E-4340-85A3-A5531E510DB2}">
-      <thm15:themeFamily xmlns="" xmlns:thm15="http://schemas.microsoft.com/office/thememl/2012/main" name="Office Theme" id="{62F939B6-93AF-4DB8-9C6B-D6C7DFDC589F}" vid="{4A3C46E8-61CC-4603-A589-7422A47A8E4A}"/>
+      <thm15:themeFamily xmlns:thm15="http://schemas.microsoft.com/office/thememl/2012/main" xmlns="" name="Office Theme" id="{62F939B6-93AF-4DB8-9C6B-D6C7DFDC589F}" vid="{4A3C46E8-61CC-4603-A589-7422A47A8E4A}"/>
     </a:ext>
   </a:extLst>
 </a:theme>

</xml_diff>

<commit_message>
udpate notes of reading of IELTS
</commit_message>
<xml_diff>
--- a/IELTS Notes/Notes of IELTS.docx
+++ b/IELTS Notes/Notes of IELTS.docx
@@ -5172,7 +5172,7 @@
         </w:numPr>
         <w:ind w:firstLineChars="0"/>
         <w:rPr>
-          <w:rFonts w:ascii="Times New Roman" w:hAnsi="Times New Roman" w:cs="Times New Roman" w:hint="eastAsia"/>
+          <w:rFonts w:ascii="Times New Roman" w:hAnsi="Times New Roman" w:cs="Times New Roman"/>
           <w:sz w:val="24"/>
           <w:szCs w:val="24"/>
         </w:rPr>
@@ -5675,7 +5675,7 @@
         </w:numPr>
         <w:ind w:firstLineChars="0"/>
         <w:rPr>
-          <w:rFonts w:ascii="Times New Roman" w:hAnsi="Times New Roman" w:cs="Times New Roman" w:hint="eastAsia"/>
+          <w:rFonts w:ascii="Times New Roman" w:hAnsi="Times New Roman" w:cs="Times New Roman"/>
           <w:sz w:val="24"/>
           <w:szCs w:val="24"/>
         </w:rPr>
@@ -5694,7 +5694,7 @@
         <w:pStyle w:val="a3"/>
         <w:ind w:left="720" w:firstLineChars="0" w:firstLine="0"/>
         <w:rPr>
-          <w:rFonts w:ascii="Times New Roman" w:hAnsi="Times New Roman" w:cs="Times New Roman" w:hint="eastAsia"/>
+          <w:rFonts w:ascii="Times New Roman" w:hAnsi="Times New Roman" w:cs="Times New Roman"/>
           <w:sz w:val="24"/>
           <w:szCs w:val="24"/>
         </w:rPr>
@@ -5717,7 +5717,7 @@
         </w:numPr>
         <w:ind w:firstLineChars="0"/>
         <w:rPr>
-          <w:rFonts w:ascii="Times New Roman" w:hAnsi="Times New Roman" w:cs="Times New Roman" w:hint="eastAsia"/>
+          <w:rFonts w:ascii="Times New Roman" w:hAnsi="Times New Roman" w:cs="Times New Roman"/>
           <w:sz w:val="24"/>
           <w:szCs w:val="24"/>
         </w:rPr>
@@ -5756,7 +5756,7 @@
         </w:numPr>
         <w:ind w:firstLineChars="0"/>
         <w:rPr>
-          <w:rFonts w:ascii="Times New Roman" w:hAnsi="Times New Roman" w:cs="Times New Roman" w:hint="eastAsia"/>
+          <w:rFonts w:ascii="Times New Roman" w:hAnsi="Times New Roman" w:cs="Times New Roman"/>
           <w:sz w:val="24"/>
           <w:szCs w:val="24"/>
         </w:rPr>
@@ -5796,7 +5796,7 @@
         </w:numPr>
         <w:ind w:firstLineChars="0"/>
         <w:rPr>
-          <w:rFonts w:ascii="Times New Roman" w:hAnsi="Times New Roman" w:cs="Times New Roman" w:hint="eastAsia"/>
+          <w:rFonts w:ascii="Times New Roman" w:hAnsi="Times New Roman" w:cs="Times New Roman"/>
           <w:sz w:val="24"/>
           <w:szCs w:val="24"/>
         </w:rPr>
@@ -5851,7 +5851,7 @@
         </w:numPr>
         <w:ind w:firstLineChars="0"/>
         <w:rPr>
-          <w:rFonts w:ascii="Times New Roman" w:hAnsi="Times New Roman" w:cs="Times New Roman" w:hint="eastAsia"/>
+          <w:rFonts w:ascii="Times New Roman" w:hAnsi="Times New Roman" w:cs="Times New Roman"/>
           <w:sz w:val="24"/>
           <w:szCs w:val="24"/>
         </w:rPr>
@@ -5890,7 +5890,7 @@
         </w:numPr>
         <w:ind w:firstLineChars="0"/>
         <w:rPr>
-          <w:rFonts w:ascii="Times New Roman" w:hAnsi="Times New Roman" w:cs="Times New Roman" w:hint="eastAsia"/>
+          <w:rFonts w:ascii="Times New Roman" w:hAnsi="Times New Roman" w:cs="Times New Roman"/>
           <w:sz w:val="24"/>
           <w:szCs w:val="24"/>
         </w:rPr>
@@ -5929,7 +5929,7 @@
         </w:numPr>
         <w:ind w:firstLineChars="0"/>
         <w:rPr>
-          <w:rFonts w:ascii="Times New Roman" w:hAnsi="Times New Roman" w:cs="Times New Roman" w:hint="eastAsia"/>
+          <w:rFonts w:ascii="Times New Roman" w:hAnsi="Times New Roman" w:cs="Times New Roman"/>
           <w:sz w:val="24"/>
           <w:szCs w:val="24"/>
         </w:rPr>
@@ -6053,8 +6053,6 @@
         </w:rPr>
         <w:t xml:space="preserve">ourself and listen to yourself so that you can correct yourself. </w:t>
       </w:r>
-      <w:bookmarkStart w:id="0" w:name="_GoBack"/>
-      <w:bookmarkEnd w:id="0"/>
     </w:p>
     <w:p>
       <w:pPr>
@@ -6375,7 +6373,7 @@
           <w:sz w:val="24"/>
           <w:szCs w:val="24"/>
         </w:rPr>
-        <w:t>An Example</w:t>
+        <w:t>Here is a</w:t>
       </w:r>
       <w:r>
         <w:rPr>
@@ -6384,6 +6382,15 @@
           <w:sz w:val="24"/>
           <w:szCs w:val="24"/>
         </w:rPr>
+        <w:t>n Example</w:t>
+      </w:r>
+      <w:r>
+        <w:rPr>
+          <w:rFonts w:ascii="Times New Roman" w:hAnsi="Times New Roman" w:cs="Times New Roman" w:hint="eastAsia"/>
+          <w:i/>
+          <w:sz w:val="24"/>
+          <w:szCs w:val="24"/>
+        </w:rPr>
         <w:t>.</w:t>
       </w:r>
     </w:p>
@@ -6588,7 +6595,7 @@
       <w:pPr>
         <w:ind w:left="1080"/>
         <w:rPr>
-          <w:rFonts w:ascii="Times New Roman" w:hAnsi="Times New Roman" w:cs="Times New Roman"/>
+          <w:rFonts w:ascii="Times New Roman" w:hAnsi="Times New Roman" w:cs="Times New Roman" w:hint="eastAsia"/>
           <w:sz w:val="24"/>
           <w:szCs w:val="24"/>
         </w:rPr>
@@ -6609,6 +6616,142 @@
           <w:szCs w:val="24"/>
         </w:rPr>
         <w:t>: allocate</w:t>
+      </w:r>
+    </w:p>
+    <w:p>
+      <w:pPr>
+        <w:pStyle w:val="a3"/>
+        <w:numPr>
+          <w:ilvl w:val="0"/>
+          <w:numId w:val="3"/>
+        </w:numPr>
+        <w:ind w:firstLineChars="0"/>
+        <w:rPr>
+          <w:rFonts w:ascii="Times New Roman" w:hAnsi="Times New Roman" w:cs="Times New Roman" w:hint="eastAsia"/>
+          <w:sz w:val="24"/>
+          <w:szCs w:val="24"/>
+        </w:rPr>
+      </w:pPr>
+      <w:r>
+        <w:rPr>
+          <w:rFonts w:ascii="Times New Roman" w:hAnsi="Times New Roman" w:cs="Times New Roman" w:hint="eastAsia"/>
+          <w:sz w:val="24"/>
+          <w:szCs w:val="24"/>
+        </w:rPr>
+        <w:t>Remember the meaning of False/No.</w:t>
+      </w:r>
+    </w:p>
+    <w:p>
+      <w:pPr>
+        <w:pStyle w:val="a3"/>
+        <w:ind w:left="1080" w:firstLineChars="0" w:firstLine="0"/>
+        <w:rPr>
+          <w:rFonts w:ascii="Times New Roman" w:hAnsi="Times New Roman" w:cs="Times New Roman" w:hint="eastAsia"/>
+          <w:sz w:val="24"/>
+          <w:szCs w:val="24"/>
+        </w:rPr>
+      </w:pPr>
+      <w:r>
+        <w:rPr>
+          <w:rFonts w:ascii="Times New Roman" w:hAnsi="Times New Roman" w:cs="Times New Roman" w:hint="eastAsia"/>
+          <w:sz w:val="24"/>
+          <w:szCs w:val="24"/>
+        </w:rPr>
+        <w:t>False/No = the information does not match. (x)</w:t>
+      </w:r>
+    </w:p>
+    <w:p>
+      <w:pPr>
+        <w:pStyle w:val="a3"/>
+        <w:ind w:left="1080" w:firstLineChars="0" w:firstLine="0"/>
+        <w:rPr>
+          <w:rFonts w:ascii="Times New Roman" w:hAnsi="Times New Roman" w:cs="Times New Roman" w:hint="eastAsia"/>
+          <w:sz w:val="24"/>
+          <w:szCs w:val="24"/>
+        </w:rPr>
+      </w:pPr>
+      <w:r>
+        <w:rPr>
+          <w:rFonts w:ascii="Times New Roman" w:hAnsi="Times New Roman" w:cs="Times New Roman" w:hint="eastAsia"/>
+          <w:sz w:val="24"/>
+          <w:szCs w:val="24"/>
+        </w:rPr>
+        <w:t>False/No = the information is oppsite (</w:t>
+      </w:r>
+      <w:r>
+        <w:rPr>
+          <w:rFonts w:ascii="MS Gothic" w:eastAsia="MS Gothic" w:hAnsi="MS Gothic" w:cs="MS Gothic" w:hint="eastAsia"/>
+        </w:rPr>
+        <w:t>✓</w:t>
+      </w:r>
+      <w:r>
+        <w:rPr>
+          <w:rFonts w:ascii="Times New Roman" w:hAnsi="Times New Roman" w:cs="Times New Roman" w:hint="eastAsia"/>
+          <w:sz w:val="24"/>
+          <w:szCs w:val="24"/>
+        </w:rPr>
+        <w:t>)</w:t>
+      </w:r>
+      <w:r>
+        <w:rPr>
+          <w:rFonts w:ascii="Times New Roman" w:hAnsi="Times New Roman" w:cs="Times New Roman" w:hint="eastAsia"/>
+          <w:sz w:val="24"/>
+          <w:szCs w:val="24"/>
+        </w:rPr>
+        <w:t>.</w:t>
+      </w:r>
+    </w:p>
+    <w:p>
+      <w:pPr>
+        <w:pStyle w:val="a3"/>
+        <w:ind w:left="1080" w:firstLineChars="0" w:firstLine="0"/>
+        <w:rPr>
+          <w:rFonts w:ascii="Times New Roman" w:hAnsi="Times New Roman" w:cs="Times New Roman"/>
+          <w:sz w:val="24"/>
+          <w:szCs w:val="24"/>
+        </w:rPr>
+      </w:pPr>
+      <w:r>
+        <w:rPr>
+          <w:rFonts w:ascii="Times New Roman" w:hAnsi="Times New Roman" w:cs="Times New Roman" w:hint="eastAsia"/>
+          <w:sz w:val="24"/>
+          <w:szCs w:val="24"/>
+        </w:rPr>
+        <w:t xml:space="preserve">Note that if a statement is False or No, it must be the opposite meaning of the </w:t>
+      </w:r>
+      <w:r>
+        <w:rPr>
+          <w:rFonts w:ascii="Times New Roman" w:hAnsi="Times New Roman" w:cs="Times New Roman" w:hint="eastAsia"/>
+          <w:sz w:val="24"/>
+          <w:szCs w:val="24"/>
+        </w:rPr>
+        <w:t>sentence</w:t>
+      </w:r>
+      <w:bookmarkStart w:id="0" w:name="_GoBack"/>
+      <w:bookmarkEnd w:id="0"/>
+      <w:r>
+        <w:rPr>
+          <w:rFonts w:ascii="Times New Roman" w:hAnsi="Times New Roman" w:cs="Times New Roman" w:hint="eastAsia"/>
+          <w:sz w:val="24"/>
+          <w:szCs w:val="24"/>
+        </w:rPr>
+        <w:t xml:space="preserve"> in the passage, but it dosen</w:t>
+      </w:r>
+      <w:r>
+        <w:rPr>
+          <w:rFonts w:ascii="Times New Roman" w:hAnsi="Times New Roman" w:cs="Times New Roman"/>
+          <w:sz w:val="24"/>
+          <w:szCs w:val="24"/>
+        </w:rPr>
+        <w:t>’</w:t>
+      </w:r>
+      <w:r>
+        <w:rPr>
+          <w:rFonts w:ascii="Times New Roman" w:hAnsi="Times New Roman" w:cs="Times New Roman" w:hint="eastAsia"/>
+          <w:sz w:val="24"/>
+          <w:szCs w:val="24"/>
+        </w:rPr>
+        <w:t xml:space="preserve">t mean that it does not match. </w:t>
       </w:r>
     </w:p>
     <w:p>
@@ -6704,6 +6847,7 @@
           <w:sz w:val="24"/>
           <w:szCs w:val="24"/>
         </w:rPr>
+        <w:lastRenderedPageBreak/>
         <w:t xml:space="preserve">Use synonyms as more as possible. </w:t>
       </w:r>
       <w:r>
@@ -6871,16 +7015,7 @@
           <w:sz w:val="24"/>
           <w:szCs w:val="24"/>
         </w:rPr>
-        <w:t xml:space="preserve">ones. </w:t>
-      </w:r>
-      <w:r>
-        <w:rPr>
-          <w:rFonts w:ascii="Times New Roman" w:hAnsi="Times New Roman" w:cs="Times New Roman"/>
-          <w:sz w:val="24"/>
-          <w:szCs w:val="24"/>
-        </w:rPr>
-        <w:lastRenderedPageBreak/>
-        <w:t>a-&gt;b, b-&gt;c…</w:t>
+        <w:t>ones. a-&gt;b, b-&gt;c…</w:t>
       </w:r>
       <w:r>
         <w:rPr>
@@ -8153,6 +8288,7 @@
           <w:szCs w:val="24"/>
           <w:lang w:val="en-GB"/>
         </w:rPr>
+        <w:lastRenderedPageBreak/>
         <w:t>Don</w:t>
       </w:r>
       <w:r>
@@ -8342,16 +8478,7 @@
           <w:sz w:val="24"/>
           <w:szCs w:val="24"/>
         </w:rPr>
-        <w:t xml:space="preserve"> is </w:t>
-      </w:r>
-      <w:r>
-        <w:rPr>
-          <w:rFonts w:ascii="Times New Roman" w:hAnsi="Times New Roman" w:cs="Times New Roman" w:hint="eastAsia"/>
-          <w:sz w:val="24"/>
-          <w:szCs w:val="24"/>
-        </w:rPr>
-        <w:lastRenderedPageBreak/>
-        <w:t xml:space="preserve">too direct and simple. Instead, we should write sentence like </w:t>
+        <w:t xml:space="preserve"> is too direct and simple. Instead, we should write sentence like </w:t>
       </w:r>
       <w:r>
         <w:rPr>
@@ -17478,7 +17605,7 @@
   <a:extraClrSchemeLst/>
   <a:extLst>
     <a:ext uri="{05A4C25C-085E-4340-85A3-A5531E510DB2}">
-      <thm15:themeFamily xmlns:thm15="http://schemas.microsoft.com/office/thememl/2012/main" xmlns="" name="Office Theme" id="{62F939B6-93AF-4DB8-9C6B-D6C7DFDC589F}" vid="{4A3C46E8-61CC-4603-A589-7422A47A8E4A}"/>
+      <thm15:themeFamily xmlns="" xmlns:thm15="http://schemas.microsoft.com/office/thememl/2012/main" name="Office Theme" id="{62F939B6-93AF-4DB8-9C6B-D6C7DFDC589F}" vid="{4A3C46E8-61CC-4603-A589-7422A47A8E4A}"/>
     </a:ext>
   </a:extLst>
 </a:theme>

</xml_diff>